<commit_message>
-Krige Interpolation Uncertainty Finalized - Output table developed and formated using Great Tables
</commit_message>
<xml_diff>
--- a/Diffusion Round Robin/Towbin-Diffusion-Round-Robin-Results.docx
+++ b/Diffusion Round Robin/Towbin-Diffusion-Round-Robin-Results.docx
@@ -58,27 +58,1648 @@
         <w:t xml:space="preserve"> from a buffer position (or provide a tool/spreadsheet if you do not have it hard coded).</w:t>
       </w:r>
     </w:p>
+    <w:p>
+      <w:pPr>
+        <w:pStyle w:val="p1"/>
+      </w:pPr>
+    </w:p>
+    <w:p>
+      <w:pPr>
+        <w:tabs>
+          <w:tab w:val="left" w:pos="916"/>
+          <w:tab w:val="left" w:pos="1832"/>
+          <w:tab w:val="left" w:pos="2748"/>
+          <w:tab w:val="left" w:pos="3664"/>
+          <w:tab w:val="left" w:pos="4580"/>
+          <w:tab w:val="left" w:pos="5496"/>
+          <w:tab w:val="left" w:pos="6412"/>
+          <w:tab w:val="left" w:pos="7328"/>
+          <w:tab w:val="left" w:pos="8244"/>
+          <w:tab w:val="left" w:pos="9160"/>
+          <w:tab w:val="left" w:pos="10076"/>
+          <w:tab w:val="left" w:pos="10992"/>
+          <w:tab w:val="left" w:pos="11908"/>
+          <w:tab w:val="left" w:pos="12824"/>
+          <w:tab w:val="left" w:pos="13740"/>
+          <w:tab w:val="left" w:pos="14656"/>
+        </w:tabs>
+        <w:spacing w:line="225" w:lineRule="atLeast"/>
+        <w:rPr>
+          <w:rFonts w:ascii="Menlo" w:hAnsi="Menlo" w:cs="Menlo"/>
+          <w:sz w:val="18"/>
+          <w:szCs w:val="18"/>
+        </w:rPr>
+      </w:pPr>
+      <w:r>
+        <w:rPr>
+          <w:rFonts w:ascii="Menlo" w:hAnsi="Menlo" w:cs="Menlo"/>
+          <w:sz w:val="18"/>
+          <w:szCs w:val="18"/>
+        </w:rPr>
+        <w:t>10</w:t>
+      </w:r>
+      <w:r>
+        <w:rPr>
+          <w:rFonts w:ascii="Menlo" w:hAnsi="Menlo" w:cs="Menlo"/>
+          <w:sz w:val="18"/>
+          <w:szCs w:val="18"/>
+          <w:vertAlign w:val="superscript"/>
+        </w:rPr>
+        <w:t>-7.869</w:t>
+      </w:r>
+      <w:r>
+        <w:rPr>
+          <w:rFonts w:ascii="Menlo" w:hAnsi="Menlo" w:cs="Menlo"/>
+          <w:sz w:val="18"/>
+          <w:szCs w:val="18"/>
+        </w:rPr>
+        <w:t xml:space="preserve"> Bar. Using equations from Frost 1991 reviews in Mineralogy Volume 25. </w:t>
+      </w:r>
+    </w:p>
+    <w:p>
+      <w:pPr>
+        <w:tabs>
+          <w:tab w:val="left" w:pos="916"/>
+          <w:tab w:val="left" w:pos="1832"/>
+          <w:tab w:val="left" w:pos="2748"/>
+          <w:tab w:val="left" w:pos="3664"/>
+          <w:tab w:val="left" w:pos="4580"/>
+          <w:tab w:val="left" w:pos="5496"/>
+          <w:tab w:val="left" w:pos="6412"/>
+          <w:tab w:val="left" w:pos="7328"/>
+          <w:tab w:val="left" w:pos="8244"/>
+          <w:tab w:val="left" w:pos="9160"/>
+          <w:tab w:val="left" w:pos="10076"/>
+          <w:tab w:val="left" w:pos="10992"/>
+          <w:tab w:val="left" w:pos="11908"/>
+          <w:tab w:val="left" w:pos="12824"/>
+          <w:tab w:val="left" w:pos="13740"/>
+          <w:tab w:val="left" w:pos="14656"/>
+        </w:tabs>
+        <w:spacing w:line="225" w:lineRule="atLeast"/>
+        <w:rPr>
+          <w:rFonts w:ascii="Menlo" w:hAnsi="Menlo" w:cs="Menlo"/>
+          <w:sz w:val="18"/>
+          <w:szCs w:val="18"/>
+        </w:rPr>
+      </w:pPr>
+      <w:r>
+        <w:rPr>
+          <w:rFonts w:ascii="Menlo" w:hAnsi="Menlo" w:cs="Menlo"/>
+          <w:sz w:val="18"/>
+          <w:szCs w:val="18"/>
+        </w:rPr>
+        <w:t xml:space="preserve">Code provided in attached python sheets. </w:t>
+      </w:r>
+    </w:p>
+    <w:p>
+      <w:pPr>
+        <w:tabs>
+          <w:tab w:val="left" w:pos="916"/>
+          <w:tab w:val="left" w:pos="1832"/>
+          <w:tab w:val="left" w:pos="2748"/>
+          <w:tab w:val="left" w:pos="3664"/>
+          <w:tab w:val="left" w:pos="4580"/>
+          <w:tab w:val="left" w:pos="5496"/>
+          <w:tab w:val="left" w:pos="6412"/>
+          <w:tab w:val="left" w:pos="7328"/>
+          <w:tab w:val="left" w:pos="8244"/>
+          <w:tab w:val="left" w:pos="9160"/>
+          <w:tab w:val="left" w:pos="10076"/>
+          <w:tab w:val="left" w:pos="10992"/>
+          <w:tab w:val="left" w:pos="11908"/>
+          <w:tab w:val="left" w:pos="12824"/>
+          <w:tab w:val="left" w:pos="13740"/>
+          <w:tab w:val="left" w:pos="14656"/>
+        </w:tabs>
+        <w:spacing w:line="225" w:lineRule="atLeast"/>
+        <w:rPr>
+          <w:rFonts w:ascii="Menlo" w:hAnsi="Menlo" w:cs="Menlo"/>
+          <w:sz w:val="18"/>
+          <w:szCs w:val="18"/>
+        </w:rPr>
+      </w:pPr>
+    </w:p>
+    <w:p>
+      <w:pPr>
+        <w:tabs>
+          <w:tab w:val="left" w:pos="916"/>
+          <w:tab w:val="left" w:pos="1832"/>
+          <w:tab w:val="left" w:pos="2748"/>
+          <w:tab w:val="left" w:pos="3664"/>
+          <w:tab w:val="left" w:pos="4580"/>
+          <w:tab w:val="left" w:pos="5496"/>
+          <w:tab w:val="left" w:pos="6412"/>
+          <w:tab w:val="left" w:pos="7328"/>
+          <w:tab w:val="left" w:pos="8244"/>
+          <w:tab w:val="left" w:pos="9160"/>
+          <w:tab w:val="left" w:pos="10076"/>
+          <w:tab w:val="left" w:pos="10992"/>
+          <w:tab w:val="left" w:pos="11908"/>
+          <w:tab w:val="left" w:pos="12824"/>
+          <w:tab w:val="left" w:pos="13740"/>
+          <w:tab w:val="left" w:pos="14656"/>
+        </w:tabs>
+        <w:spacing w:line="225" w:lineRule="atLeast"/>
+        <w:rPr>
+          <w:rFonts w:ascii="Menlo" w:hAnsi="Menlo" w:cs="Menlo"/>
+          <w:sz w:val="18"/>
+          <w:szCs w:val="18"/>
+        </w:rPr>
+      </w:pPr>
+    </w:p>
+    <w:p>
+      <w:pPr>
+        <w:tabs>
+          <w:tab w:val="left" w:pos="916"/>
+          <w:tab w:val="left" w:pos="1832"/>
+          <w:tab w:val="left" w:pos="2748"/>
+          <w:tab w:val="left" w:pos="3664"/>
+          <w:tab w:val="left" w:pos="4580"/>
+          <w:tab w:val="left" w:pos="5496"/>
+          <w:tab w:val="left" w:pos="6412"/>
+          <w:tab w:val="left" w:pos="7328"/>
+          <w:tab w:val="left" w:pos="8244"/>
+          <w:tab w:val="left" w:pos="9160"/>
+          <w:tab w:val="left" w:pos="10076"/>
+          <w:tab w:val="left" w:pos="10992"/>
+          <w:tab w:val="left" w:pos="11908"/>
+          <w:tab w:val="left" w:pos="12824"/>
+          <w:tab w:val="left" w:pos="13740"/>
+          <w:tab w:val="left" w:pos="14656"/>
+        </w:tabs>
+        <w:spacing w:line="225" w:lineRule="atLeast"/>
+        <w:rPr>
+          <w:rFonts w:ascii="Menlo" w:hAnsi="Menlo" w:cs="Menlo"/>
+          <w:sz w:val="18"/>
+          <w:szCs w:val="18"/>
+        </w:rPr>
+      </w:pPr>
+    </w:p>
+    <w:p>
+      <w:pPr>
+        <w:pStyle w:val="p1"/>
+      </w:pPr>
+      <w:r>
+        <w:t xml:space="preserve">b) Assume a </w:t>
+      </w:r>
+      <w:r>
+        <w:rPr>
+          <w:b/>
+          <w:bCs/>
+        </w:rPr>
+        <w:t>Fo82</w:t>
+      </w:r>
+      <w:r>
+        <w:t xml:space="preserve"> olivine at 1200°C, 420 bars, and log(fO</w:t>
+      </w:r>
+      <w:r>
+        <w:rPr>
+          <w:rStyle w:val="s1"/>
+          <w:rFonts w:eastAsiaTheme="majorEastAsia"/>
+        </w:rPr>
+        <w:t>2</w:t>
+      </w:r>
+      <w:r>
+        <w:t>) = -7.87 in bars and a profile parallel to the</w:t>
+      </w:r>
+    </w:p>
+    <w:p>
+      <w:pPr>
+        <w:pStyle w:val="p1"/>
+      </w:pPr>
+      <w:r>
+        <w:t>c-axis [001] (parallel to the red dotted line). What diffusion coefficient do you calculate? Again, please</w:t>
+      </w:r>
+    </w:p>
+    <w:p>
+      <w:pPr>
+        <w:pStyle w:val="p1"/>
+      </w:pPr>
+      <w:r>
+        <w:t>provide the equation you are using, and the values for the inputs into the equation (i.e. show your work!).</w:t>
+      </w:r>
+    </w:p>
+    <w:p>
+      <w:pPr>
+        <w:tabs>
+          <w:tab w:val="left" w:pos="916"/>
+          <w:tab w:val="left" w:pos="1832"/>
+          <w:tab w:val="left" w:pos="2748"/>
+          <w:tab w:val="left" w:pos="3664"/>
+          <w:tab w:val="left" w:pos="4580"/>
+          <w:tab w:val="left" w:pos="5496"/>
+          <w:tab w:val="left" w:pos="6412"/>
+          <w:tab w:val="left" w:pos="7328"/>
+          <w:tab w:val="left" w:pos="8244"/>
+          <w:tab w:val="left" w:pos="9160"/>
+          <w:tab w:val="left" w:pos="10076"/>
+          <w:tab w:val="left" w:pos="10992"/>
+          <w:tab w:val="left" w:pos="11908"/>
+          <w:tab w:val="left" w:pos="12824"/>
+          <w:tab w:val="left" w:pos="13740"/>
+          <w:tab w:val="left" w:pos="14656"/>
+        </w:tabs>
+        <w:spacing w:line="225" w:lineRule="atLeast"/>
+        <w:rPr>
+          <w:rFonts w:ascii="Menlo" w:hAnsi="Menlo" w:cs="Menlo"/>
+          <w:sz w:val="18"/>
+          <w:szCs w:val="18"/>
+        </w:rPr>
+      </w:pPr>
+    </w:p>
+    <w:p>
+      <w:pPr>
+        <w:tabs>
+          <w:tab w:val="left" w:pos="916"/>
+          <w:tab w:val="left" w:pos="1832"/>
+          <w:tab w:val="left" w:pos="2748"/>
+          <w:tab w:val="left" w:pos="3664"/>
+          <w:tab w:val="left" w:pos="4580"/>
+          <w:tab w:val="left" w:pos="5496"/>
+          <w:tab w:val="left" w:pos="6412"/>
+          <w:tab w:val="left" w:pos="7328"/>
+          <w:tab w:val="left" w:pos="8244"/>
+          <w:tab w:val="left" w:pos="9160"/>
+          <w:tab w:val="left" w:pos="10076"/>
+          <w:tab w:val="left" w:pos="10992"/>
+          <w:tab w:val="left" w:pos="11908"/>
+          <w:tab w:val="left" w:pos="12824"/>
+          <w:tab w:val="left" w:pos="13740"/>
+          <w:tab w:val="left" w:pos="14656"/>
+        </w:tabs>
+        <w:spacing w:line="225" w:lineRule="atLeast"/>
+        <w:rPr>
+          <w:rFonts w:ascii="Menlo" w:hAnsi="Menlo" w:cs="Menlo"/>
+          <w:sz w:val="18"/>
+          <w:szCs w:val="18"/>
+        </w:rPr>
+      </w:pPr>
+      <w:r>
+        <w:rPr>
+          <w:rFonts w:ascii="Menlo" w:hAnsi="Menlo" w:cs="Menlo"/>
+          <w:sz w:val="18"/>
+          <w:szCs w:val="18"/>
+        </w:rPr>
+        <w:t>5.594</w:t>
+      </w:r>
+      <w:r>
+        <w:rPr>
+          <w:rFonts w:ascii="Menlo" w:hAnsi="Menlo" w:cs="Menlo"/>
+          <w:sz w:val="18"/>
+          <w:szCs w:val="18"/>
+        </w:rPr>
+        <w:t xml:space="preserve"> </w:t>
+      </w:r>
+      <w:r>
+        <w:rPr>
+          <w:rFonts w:ascii="Menlo" w:hAnsi="Menlo" w:cs="Menlo"/>
+          <w:sz w:val="18"/>
+          <w:szCs w:val="18"/>
+        </w:rPr>
+        <w:t>*</w:t>
+      </w:r>
+      <w:r>
+        <w:rPr>
+          <w:rFonts w:ascii="Menlo" w:hAnsi="Menlo" w:cs="Menlo"/>
+          <w:sz w:val="18"/>
+          <w:szCs w:val="18"/>
+        </w:rPr>
+        <w:t xml:space="preserve"> </w:t>
+      </w:r>
+      <w:r>
+        <w:rPr>
+          <w:rFonts w:ascii="Menlo" w:hAnsi="Menlo" w:cs="Menlo"/>
+          <w:sz w:val="18"/>
+          <w:szCs w:val="18"/>
+        </w:rPr>
+        <w:t>10</w:t>
+      </w:r>
+      <w:r>
+        <w:rPr>
+          <w:rFonts w:ascii="Menlo" w:hAnsi="Menlo" w:cs="Menlo"/>
+          <w:sz w:val="18"/>
+          <w:szCs w:val="18"/>
+          <w:vertAlign w:val="superscript"/>
+        </w:rPr>
+        <w:t>-17</w:t>
+      </w:r>
+      <w:r>
+        <w:rPr>
+          <w:rFonts w:ascii="Menlo" w:hAnsi="Menlo" w:cs="Menlo"/>
+          <w:sz w:val="18"/>
+          <w:szCs w:val="18"/>
+        </w:rPr>
+        <w:t xml:space="preserve"> m</w:t>
+      </w:r>
+      <w:r>
+        <w:rPr>
+          <w:rFonts w:ascii="Menlo" w:hAnsi="Menlo" w:cs="Menlo"/>
+          <w:sz w:val="18"/>
+          <w:szCs w:val="18"/>
+          <w:vertAlign w:val="superscript"/>
+        </w:rPr>
+        <w:t>2</w:t>
+      </w:r>
+      <w:r>
+        <w:rPr>
+          <w:rFonts w:ascii="Menlo" w:hAnsi="Menlo" w:cs="Menlo"/>
+          <w:sz w:val="18"/>
+          <w:szCs w:val="18"/>
+        </w:rPr>
+        <w:t>/s</w:t>
+      </w:r>
+      <w:r>
+        <w:rPr>
+          <w:rFonts w:ascii="Menlo" w:hAnsi="Menlo" w:cs="Menlo"/>
+          <w:sz w:val="18"/>
+          <w:szCs w:val="18"/>
+        </w:rPr>
+        <w:t xml:space="preserve"> based on the </w:t>
+      </w:r>
+      <w:r>
+        <w:rPr>
+          <w:rFonts w:ascii="Menlo" w:hAnsi="Menlo" w:cs="Menlo"/>
+          <w:sz w:val="18"/>
+          <w:szCs w:val="18"/>
+        </w:rPr>
+        <w:t xml:space="preserve">diffusivities used in DIPRA (Girona and Costa, 2013). The Diffusivity functions I use can be found in the attached python scripts.   </w:t>
+      </w:r>
+    </w:p>
+    <w:p>
+      <w:pPr>
+        <w:tabs>
+          <w:tab w:val="left" w:pos="916"/>
+          <w:tab w:val="left" w:pos="1832"/>
+          <w:tab w:val="left" w:pos="2748"/>
+          <w:tab w:val="left" w:pos="3664"/>
+          <w:tab w:val="left" w:pos="4580"/>
+          <w:tab w:val="left" w:pos="5496"/>
+          <w:tab w:val="left" w:pos="6412"/>
+          <w:tab w:val="left" w:pos="7328"/>
+          <w:tab w:val="left" w:pos="8244"/>
+          <w:tab w:val="left" w:pos="9160"/>
+          <w:tab w:val="left" w:pos="10076"/>
+          <w:tab w:val="left" w:pos="10992"/>
+          <w:tab w:val="left" w:pos="11908"/>
+          <w:tab w:val="left" w:pos="12824"/>
+          <w:tab w:val="left" w:pos="13740"/>
+          <w:tab w:val="left" w:pos="14656"/>
+        </w:tabs>
+        <w:spacing w:line="225" w:lineRule="atLeast"/>
+        <w:rPr>
+          <w:rFonts w:ascii="Menlo" w:hAnsi="Menlo" w:cs="Menlo"/>
+          <w:sz w:val="18"/>
+          <w:szCs w:val="18"/>
+        </w:rPr>
+      </w:pPr>
+    </w:p>
+    <w:p>
+      <w:pPr>
+        <w:tabs>
+          <w:tab w:val="left" w:pos="916"/>
+          <w:tab w:val="left" w:pos="1832"/>
+          <w:tab w:val="left" w:pos="2748"/>
+          <w:tab w:val="left" w:pos="3664"/>
+          <w:tab w:val="left" w:pos="4580"/>
+          <w:tab w:val="left" w:pos="5496"/>
+          <w:tab w:val="left" w:pos="6412"/>
+          <w:tab w:val="left" w:pos="7328"/>
+          <w:tab w:val="left" w:pos="8244"/>
+          <w:tab w:val="left" w:pos="9160"/>
+          <w:tab w:val="left" w:pos="10076"/>
+          <w:tab w:val="left" w:pos="10992"/>
+          <w:tab w:val="left" w:pos="11908"/>
+          <w:tab w:val="left" w:pos="12824"/>
+          <w:tab w:val="left" w:pos="13740"/>
+          <w:tab w:val="left" w:pos="14656"/>
+        </w:tabs>
+        <w:spacing w:line="225" w:lineRule="atLeast"/>
+        <w:rPr>
+          <w:rFonts w:ascii="Menlo" w:hAnsi="Menlo" w:cs="Menlo"/>
+          <w:sz w:val="18"/>
+          <w:szCs w:val="18"/>
+        </w:rPr>
+      </w:pPr>
+    </w:p>
+    <w:p>
+      <w:pPr>
+        <w:pStyle w:val="p1"/>
+      </w:pPr>
+      <w:r>
+        <w:t>1c) Calculate D at 1200°C, 420 bars, and log(fO</w:t>
+      </w:r>
+      <w:r>
+        <w:rPr>
+          <w:rStyle w:val="s1"/>
+          <w:rFonts w:eastAsiaTheme="majorEastAsia"/>
+        </w:rPr>
+        <w:t>2</w:t>
+      </w:r>
+      <w:r>
+        <w:t>) = -7.87 in bars and a profile parallel to the c-axis [001]</w:t>
+      </w:r>
+    </w:p>
+    <w:p>
+      <w:pPr>
+        <w:pStyle w:val="p1"/>
+      </w:pPr>
+      <w:r>
+        <w:t xml:space="preserve">(i.e. α=90°, β=90°, γ=0°), but for a </w:t>
+      </w:r>
+      <w:r>
+        <w:rPr>
+          <w:b/>
+          <w:bCs/>
+        </w:rPr>
+        <w:t>Fo88</w:t>
+      </w:r>
+      <w:r>
+        <w:t xml:space="preserve"> olivine:</w:t>
+      </w:r>
+    </w:p>
+    <w:p>
+      <w:pPr>
+        <w:pStyle w:val="HTMLPreformatted"/>
+        <w:spacing w:line="225" w:lineRule="atLeast"/>
+        <w:rPr>
+          <w:rFonts w:ascii="Menlo" w:hAnsi="Menlo" w:cs="Menlo"/>
+          <w:sz w:val="18"/>
+          <w:szCs w:val="18"/>
+        </w:rPr>
+      </w:pPr>
+      <w:r>
+        <w:rPr>
+          <w:rFonts w:ascii="Menlo" w:hAnsi="Menlo" w:cs="Menlo"/>
+          <w:sz w:val="18"/>
+          <w:szCs w:val="18"/>
+        </w:rPr>
+        <w:t>3.696 * 10</w:t>
+      </w:r>
+      <w:r>
+        <w:rPr>
+          <w:rFonts w:ascii="Menlo" w:hAnsi="Menlo" w:cs="Menlo"/>
+          <w:sz w:val="18"/>
+          <w:szCs w:val="18"/>
+          <w:vertAlign w:val="superscript"/>
+        </w:rPr>
+        <w:t>-17</w:t>
+      </w:r>
+      <w:r>
+        <w:rPr>
+          <w:rFonts w:ascii="Menlo" w:hAnsi="Menlo" w:cs="Menlo"/>
+          <w:sz w:val="18"/>
+          <w:szCs w:val="18"/>
+        </w:rPr>
+        <w:t xml:space="preserve"> m</w:t>
+      </w:r>
+      <w:r>
+        <w:rPr>
+          <w:rFonts w:ascii="Menlo" w:hAnsi="Menlo" w:cs="Menlo"/>
+          <w:sz w:val="18"/>
+          <w:szCs w:val="18"/>
+          <w:vertAlign w:val="superscript"/>
+        </w:rPr>
+        <w:t>2</w:t>
+      </w:r>
+      <w:r>
+        <w:rPr>
+          <w:rFonts w:ascii="Menlo" w:hAnsi="Menlo" w:cs="Menlo"/>
+          <w:sz w:val="18"/>
+          <w:szCs w:val="18"/>
+        </w:rPr>
+        <w:t xml:space="preserve">/s. </w:t>
+      </w:r>
+    </w:p>
+    <w:p>
+      <w:pPr>
+        <w:pStyle w:val="HTMLPreformatted"/>
+        <w:spacing w:line="225" w:lineRule="atLeast"/>
+        <w:rPr>
+          <w:rFonts w:ascii="Menlo" w:hAnsi="Menlo" w:cs="Menlo"/>
+          <w:sz w:val="18"/>
+          <w:szCs w:val="18"/>
+        </w:rPr>
+      </w:pPr>
+    </w:p>
+    <w:p>
+      <w:pPr>
+        <w:pStyle w:val="HTMLPreformatted"/>
+        <w:spacing w:line="225" w:lineRule="atLeast"/>
+        <w:rPr>
+          <w:rFonts w:ascii="Menlo" w:hAnsi="Menlo" w:cs="Menlo"/>
+          <w:sz w:val="18"/>
+          <w:szCs w:val="18"/>
+        </w:rPr>
+      </w:pPr>
+    </w:p>
+    <w:p>
+      <w:pPr>
+        <w:pStyle w:val="p1"/>
+      </w:pPr>
+      <w:r>
+        <w:t xml:space="preserve">1d) Calculate D at </w:t>
+      </w:r>
+      <w:r>
+        <w:rPr>
+          <w:b/>
+          <w:bCs/>
+        </w:rPr>
+        <w:t>1050°C</w:t>
+      </w:r>
+      <w:r>
+        <w:t>, 420 bars, and log(fO</w:t>
+      </w:r>
+      <w:r>
+        <w:rPr>
+          <w:rStyle w:val="s1"/>
+          <w:rFonts w:eastAsiaTheme="majorEastAsia"/>
+        </w:rPr>
+        <w:t>2</w:t>
+      </w:r>
+      <w:r>
+        <w:t>) = -7.87 in bars and a profile parallel to the c-axis [001]</w:t>
+      </w:r>
+    </w:p>
+    <w:p>
+      <w:pPr>
+        <w:pStyle w:val="p1"/>
+      </w:pPr>
+      <w:r>
+        <w:t xml:space="preserve">(i.e. α=90°, β=90°, γ=0°) for a </w:t>
+      </w:r>
+      <w:r>
+        <w:rPr>
+          <w:b/>
+          <w:bCs/>
+        </w:rPr>
+        <w:t>Fo82</w:t>
+      </w:r>
+      <w:r>
+        <w:t xml:space="preserve"> olivine.</w:t>
+      </w:r>
+    </w:p>
+    <w:p>
+      <w:pPr>
+        <w:pStyle w:val="HTMLPreformatted"/>
+        <w:spacing w:line="225" w:lineRule="atLeast"/>
+        <w:rPr>
+          <w:rFonts w:ascii="Menlo" w:hAnsi="Menlo" w:cs="Menlo"/>
+          <w:sz w:val="18"/>
+          <w:szCs w:val="18"/>
+        </w:rPr>
+      </w:pPr>
+      <w:r>
+        <w:rPr>
+          <w:rFonts w:ascii="Menlo" w:hAnsi="Menlo" w:cs="Menlo"/>
+          <w:sz w:val="18"/>
+          <w:szCs w:val="18"/>
+        </w:rPr>
+        <w:t xml:space="preserve"> </w:t>
+      </w:r>
+      <w:r>
+        <w:rPr>
+          <w:rFonts w:ascii="Menlo" w:hAnsi="Menlo" w:cs="Menlo"/>
+          <w:sz w:val="18"/>
+          <w:szCs w:val="18"/>
+        </w:rPr>
+        <w:t>8.682</w:t>
+      </w:r>
+      <w:r>
+        <w:rPr>
+          <w:rFonts w:ascii="Menlo" w:hAnsi="Menlo" w:cs="Menlo"/>
+          <w:sz w:val="18"/>
+          <w:szCs w:val="18"/>
+        </w:rPr>
+        <w:t xml:space="preserve"> </w:t>
+      </w:r>
+      <w:r>
+        <w:rPr>
+          <w:rFonts w:ascii="Menlo" w:hAnsi="Menlo" w:cs="Menlo"/>
+          <w:sz w:val="18"/>
+          <w:szCs w:val="18"/>
+        </w:rPr>
+        <w:t>*</w:t>
+      </w:r>
+      <w:r>
+        <w:rPr>
+          <w:rFonts w:ascii="Menlo" w:hAnsi="Menlo" w:cs="Menlo"/>
+          <w:sz w:val="18"/>
+          <w:szCs w:val="18"/>
+        </w:rPr>
+        <w:t xml:space="preserve"> </w:t>
+      </w:r>
+      <w:r>
+        <w:rPr>
+          <w:rFonts w:ascii="Menlo" w:hAnsi="Menlo" w:cs="Menlo"/>
+          <w:sz w:val="18"/>
+          <w:szCs w:val="18"/>
+        </w:rPr>
+        <w:t>10</w:t>
+      </w:r>
+      <w:r>
+        <w:rPr>
+          <w:rFonts w:ascii="Menlo" w:hAnsi="Menlo" w:cs="Menlo"/>
+          <w:sz w:val="18"/>
+          <w:szCs w:val="18"/>
+          <w:vertAlign w:val="superscript"/>
+        </w:rPr>
+        <w:t>-18</w:t>
+      </w:r>
+      <w:r>
+        <w:rPr>
+          <w:rFonts w:ascii="Menlo" w:hAnsi="Menlo" w:cs="Menlo"/>
+          <w:sz w:val="18"/>
+          <w:szCs w:val="18"/>
+        </w:rPr>
+        <w:t xml:space="preserve"> m</w:t>
+      </w:r>
+      <w:r>
+        <w:rPr>
+          <w:rFonts w:ascii="Menlo" w:hAnsi="Menlo" w:cs="Menlo"/>
+          <w:sz w:val="18"/>
+          <w:szCs w:val="18"/>
+          <w:vertAlign w:val="superscript"/>
+        </w:rPr>
+        <w:t>2</w:t>
+      </w:r>
+      <w:r>
+        <w:rPr>
+          <w:rFonts w:ascii="Menlo" w:hAnsi="Menlo" w:cs="Menlo"/>
+          <w:sz w:val="18"/>
+          <w:szCs w:val="18"/>
+        </w:rPr>
+        <w:t xml:space="preserve">/s. </w:t>
+      </w:r>
+    </w:p>
+    <w:p>
+      <w:pPr>
+        <w:pStyle w:val="HTMLPreformatted"/>
+        <w:spacing w:line="225" w:lineRule="atLeast"/>
+        <w:rPr>
+          <w:rFonts w:ascii="Menlo" w:hAnsi="Menlo" w:cs="Menlo"/>
+          <w:sz w:val="18"/>
+          <w:szCs w:val="18"/>
+        </w:rPr>
+      </w:pPr>
+    </w:p>
+    <w:p>
+      <w:pPr>
+        <w:pStyle w:val="HTMLPreformatted"/>
+        <w:spacing w:line="225" w:lineRule="atLeast"/>
+        <w:rPr>
+          <w:rFonts w:ascii="Menlo" w:hAnsi="Menlo" w:cs="Menlo"/>
+          <w:sz w:val="18"/>
+          <w:szCs w:val="18"/>
+        </w:rPr>
+      </w:pPr>
+    </w:p>
+    <w:p>
+      <w:pPr>
+        <w:pStyle w:val="p1"/>
+      </w:pPr>
+      <w:r>
+        <w:t xml:space="preserve">1e) Calculate D at </w:t>
+      </w:r>
+      <w:r>
+        <w:rPr>
+          <w:b/>
+          <w:bCs/>
+        </w:rPr>
+        <w:t>1050°C</w:t>
+      </w:r>
+      <w:r>
+        <w:t xml:space="preserve">, </w:t>
+      </w:r>
+      <w:r>
+        <w:rPr>
+          <w:b/>
+          <w:bCs/>
+        </w:rPr>
+        <w:t>7500 bars</w:t>
+      </w:r>
+      <w:r>
+        <w:t>, and log(fO</w:t>
+      </w:r>
+      <w:r>
+        <w:rPr>
+          <w:rStyle w:val="s1"/>
+          <w:rFonts w:eastAsiaTheme="majorEastAsia"/>
+        </w:rPr>
+        <w:t>2</w:t>
+      </w:r>
+      <w:r>
+        <w:t>) = -7.87 in bars and a profile parallel to the c-axis</w:t>
+      </w:r>
+    </w:p>
+    <w:p>
+      <w:pPr>
+        <w:pStyle w:val="p1"/>
+      </w:pPr>
+      <w:r>
+        <w:t>[001] (i.e. α=90°, β=90°, γ=0°) for a</w:t>
+      </w:r>
+      <w:r>
+        <w:rPr>
+          <w:b/>
+          <w:bCs/>
+        </w:rPr>
+        <w:t xml:space="preserve"> Fo88</w:t>
+      </w:r>
+      <w:r>
+        <w:t xml:space="preserve"> olivine.</w:t>
+      </w:r>
+    </w:p>
+    <w:p>
+      <w:pPr>
+        <w:pStyle w:val="HTMLPreformatted"/>
+        <w:spacing w:line="225" w:lineRule="atLeast"/>
+        <w:rPr>
+          <w:rFonts w:ascii="Menlo" w:hAnsi="Menlo" w:cs="Menlo"/>
+          <w:sz w:val="18"/>
+          <w:szCs w:val="18"/>
+        </w:rPr>
+      </w:pPr>
+    </w:p>
+    <w:p>
+      <w:pPr>
+        <w:pStyle w:val="HTMLPreformatted"/>
+        <w:spacing w:line="225" w:lineRule="atLeast"/>
+        <w:rPr>
+          <w:rFonts w:ascii="Menlo" w:hAnsi="Menlo" w:cs="Menlo"/>
+          <w:sz w:val="18"/>
+          <w:szCs w:val="18"/>
+        </w:rPr>
+      </w:pPr>
+      <w:r>
+        <w:rPr>
+          <w:rFonts w:ascii="Menlo" w:hAnsi="Menlo" w:cs="Menlo"/>
+          <w:sz w:val="18"/>
+          <w:szCs w:val="18"/>
+        </w:rPr>
+        <w:t>3.656 * 10</w:t>
+      </w:r>
+      <w:r>
+        <w:rPr>
+          <w:rFonts w:ascii="Menlo" w:hAnsi="Menlo" w:cs="Menlo"/>
+          <w:sz w:val="18"/>
+          <w:szCs w:val="18"/>
+          <w:vertAlign w:val="superscript"/>
+        </w:rPr>
+        <w:t>-18</w:t>
+      </w:r>
+      <w:r>
+        <w:rPr>
+          <w:rFonts w:ascii="Menlo" w:hAnsi="Menlo" w:cs="Menlo"/>
+          <w:sz w:val="18"/>
+          <w:szCs w:val="18"/>
+        </w:rPr>
+        <w:t xml:space="preserve"> m</w:t>
+      </w:r>
+      <w:r>
+        <w:rPr>
+          <w:rFonts w:ascii="Menlo" w:hAnsi="Menlo" w:cs="Menlo"/>
+          <w:sz w:val="18"/>
+          <w:szCs w:val="18"/>
+          <w:vertAlign w:val="superscript"/>
+        </w:rPr>
+        <w:t>2</w:t>
+      </w:r>
+      <w:r>
+        <w:rPr>
+          <w:rFonts w:ascii="Menlo" w:hAnsi="Menlo" w:cs="Menlo"/>
+          <w:sz w:val="18"/>
+          <w:szCs w:val="18"/>
+        </w:rPr>
+        <w:t>/s.</w:t>
+      </w:r>
+    </w:p>
+    <w:p>
+      <w:pPr>
+        <w:pStyle w:val="HTMLPreformatted"/>
+        <w:spacing w:line="225" w:lineRule="atLeast"/>
+        <w:rPr>
+          <w:rFonts w:ascii="Menlo" w:hAnsi="Menlo" w:cs="Menlo"/>
+          <w:sz w:val="18"/>
+          <w:szCs w:val="18"/>
+        </w:rPr>
+      </w:pPr>
+    </w:p>
+    <w:p>
+      <w:pPr>
+        <w:pStyle w:val="HTMLPreformatted"/>
+        <w:spacing w:line="225" w:lineRule="atLeast"/>
+        <w:rPr>
+          <w:rFonts w:ascii="Menlo" w:hAnsi="Menlo" w:cs="Menlo"/>
+          <w:sz w:val="18"/>
+          <w:szCs w:val="18"/>
+        </w:rPr>
+      </w:pPr>
+    </w:p>
+    <w:p>
+      <w:pPr>
+        <w:pStyle w:val="p1"/>
+      </w:pPr>
+      <w:r>
+        <w:t>1f) Calculate D at 1050°C, 7500 bars, and</w:t>
+      </w:r>
+      <w:r>
+        <w:rPr>
+          <w:b/>
+          <w:bCs/>
+        </w:rPr>
+        <w:t xml:space="preserve"> log(fO</w:t>
+      </w:r>
+      <w:r>
+        <w:rPr>
+          <w:rStyle w:val="s1"/>
+          <w:rFonts w:eastAsiaTheme="majorEastAsia"/>
+          <w:b/>
+          <w:bCs/>
+        </w:rPr>
+        <w:t>2</w:t>
+      </w:r>
+      <w:r>
+        <w:rPr>
+          <w:b/>
+          <w:bCs/>
+        </w:rPr>
+        <w:t>) = -9.00</w:t>
+      </w:r>
+      <w:r>
+        <w:t xml:space="preserve"> in bars and a profile parallel to the c-axis</w:t>
+      </w:r>
+    </w:p>
+    <w:p>
+      <w:pPr>
+        <w:pStyle w:val="p1"/>
+      </w:pPr>
+      <w:r>
+        <w:t>[001] (i.e. α=90°, β=90</w:t>
+      </w:r>
+      <w:proofErr w:type="gramStart"/>
+      <w:r>
+        <w:t>° ,</w:t>
+      </w:r>
+      <w:proofErr w:type="gramEnd"/>
+      <w:r>
+        <w:t xml:space="preserve"> γ=0°) for a </w:t>
+      </w:r>
+      <w:r>
+        <w:rPr>
+          <w:b/>
+          <w:bCs/>
+        </w:rPr>
+        <w:t>Fo88</w:t>
+      </w:r>
+      <w:r>
+        <w:t xml:space="preserve"> olivine.</w:t>
+      </w:r>
+    </w:p>
+    <w:p>
+      <w:pPr>
+        <w:pStyle w:val="HTMLPreformatted"/>
+        <w:tabs>
+          <w:tab w:val="clear" w:pos="916"/>
+          <w:tab w:val="clear" w:pos="1832"/>
+          <w:tab w:val="clear" w:pos="2748"/>
+          <w:tab w:val="clear" w:pos="3664"/>
+          <w:tab w:val="clear" w:pos="4580"/>
+          <w:tab w:val="clear" w:pos="5496"/>
+          <w:tab w:val="clear" w:pos="6412"/>
+          <w:tab w:val="clear" w:pos="7328"/>
+          <w:tab w:val="clear" w:pos="8244"/>
+          <w:tab w:val="clear" w:pos="9160"/>
+          <w:tab w:val="clear" w:pos="10076"/>
+          <w:tab w:val="clear" w:pos="10992"/>
+          <w:tab w:val="clear" w:pos="11908"/>
+          <w:tab w:val="clear" w:pos="12824"/>
+          <w:tab w:val="clear" w:pos="13740"/>
+          <w:tab w:val="clear" w:pos="14656"/>
+          <w:tab w:val="left" w:pos="3577"/>
+        </w:tabs>
+        <w:spacing w:line="225" w:lineRule="atLeast"/>
+        <w:rPr>
+          <w:rFonts w:ascii="Menlo" w:hAnsi="Menlo" w:cs="Menlo"/>
+          <w:sz w:val="18"/>
+          <w:szCs w:val="18"/>
+        </w:rPr>
+      </w:pPr>
+      <w:r>
+        <w:rPr>
+          <w:rFonts w:ascii="Menlo" w:hAnsi="Menlo" w:cs="Menlo"/>
+          <w:sz w:val="18"/>
+          <w:szCs w:val="18"/>
+        </w:rPr>
+        <w:tab/>
+      </w:r>
+    </w:p>
+    <w:p>
+      <w:pPr>
+        <w:pStyle w:val="HTMLPreformatted"/>
+        <w:spacing w:line="225" w:lineRule="atLeast"/>
+        <w:rPr>
+          <w:rFonts w:ascii="Menlo" w:hAnsi="Menlo" w:cs="Menlo"/>
+          <w:sz w:val="18"/>
+          <w:szCs w:val="18"/>
+        </w:rPr>
+      </w:pPr>
+      <w:r>
+        <w:rPr>
+          <w:rFonts w:ascii="Menlo" w:hAnsi="Menlo" w:cs="Menlo"/>
+          <w:sz w:val="18"/>
+          <w:szCs w:val="18"/>
+        </w:rPr>
+        <w:t>2.369 * 10</w:t>
+      </w:r>
+      <w:r>
+        <w:rPr>
+          <w:rFonts w:ascii="Menlo" w:hAnsi="Menlo" w:cs="Menlo"/>
+          <w:sz w:val="18"/>
+          <w:szCs w:val="18"/>
+          <w:vertAlign w:val="superscript"/>
+        </w:rPr>
+        <w:t>-18</w:t>
+      </w:r>
+      <w:r>
+        <w:rPr>
+          <w:rFonts w:ascii="Menlo" w:hAnsi="Menlo" w:cs="Menlo"/>
+          <w:sz w:val="18"/>
+          <w:szCs w:val="18"/>
+        </w:rPr>
+        <w:t xml:space="preserve"> m</w:t>
+      </w:r>
+      <w:r>
+        <w:rPr>
+          <w:rFonts w:ascii="Menlo" w:hAnsi="Menlo" w:cs="Menlo"/>
+          <w:sz w:val="18"/>
+          <w:szCs w:val="18"/>
+          <w:vertAlign w:val="superscript"/>
+        </w:rPr>
+        <w:t>2</w:t>
+      </w:r>
+      <w:r>
+        <w:rPr>
+          <w:rFonts w:ascii="Menlo" w:hAnsi="Menlo" w:cs="Menlo"/>
+          <w:sz w:val="18"/>
+          <w:szCs w:val="18"/>
+        </w:rPr>
+        <w:t>/s</w:t>
+      </w:r>
+    </w:p>
+    <w:p>
+      <w:pPr>
+        <w:pStyle w:val="HTMLPreformatted"/>
+        <w:tabs>
+          <w:tab w:val="clear" w:pos="916"/>
+          <w:tab w:val="clear" w:pos="1832"/>
+          <w:tab w:val="clear" w:pos="2748"/>
+          <w:tab w:val="clear" w:pos="3664"/>
+          <w:tab w:val="clear" w:pos="4580"/>
+          <w:tab w:val="clear" w:pos="5496"/>
+          <w:tab w:val="clear" w:pos="6412"/>
+          <w:tab w:val="clear" w:pos="7328"/>
+          <w:tab w:val="clear" w:pos="8244"/>
+          <w:tab w:val="clear" w:pos="9160"/>
+          <w:tab w:val="clear" w:pos="10076"/>
+          <w:tab w:val="clear" w:pos="10992"/>
+          <w:tab w:val="clear" w:pos="11908"/>
+          <w:tab w:val="clear" w:pos="12824"/>
+          <w:tab w:val="clear" w:pos="13740"/>
+          <w:tab w:val="clear" w:pos="14656"/>
+          <w:tab w:val="left" w:pos="3577"/>
+        </w:tabs>
+        <w:spacing w:line="225" w:lineRule="atLeast"/>
+        <w:rPr>
+          <w:rFonts w:ascii="Menlo" w:hAnsi="Menlo" w:cs="Menlo"/>
+          <w:sz w:val="18"/>
+          <w:szCs w:val="18"/>
+        </w:rPr>
+      </w:pPr>
+    </w:p>
+    <w:p>
+      <w:pPr>
+        <w:pStyle w:val="HTMLPreformatted"/>
+        <w:spacing w:line="225" w:lineRule="atLeast"/>
+        <w:rPr>
+          <w:rFonts w:ascii="Menlo" w:hAnsi="Menlo" w:cs="Menlo"/>
+          <w:sz w:val="18"/>
+          <w:szCs w:val="18"/>
+        </w:rPr>
+      </w:pPr>
+    </w:p>
+    <w:p>
+      <w:pPr>
+        <w:pStyle w:val="p1"/>
+      </w:pPr>
+      <w:r>
+        <w:t>1g) Assume a Fo82 olivine at 1200°C, 420 bars, and log(fO</w:t>
+      </w:r>
+      <w:r>
+        <w:rPr>
+          <w:rStyle w:val="s1"/>
+          <w:rFonts w:eastAsiaTheme="majorEastAsia"/>
+        </w:rPr>
+        <w:t>2</w:t>
+      </w:r>
+      <w:r>
+        <w:t>) = -7.87 and a profile with the α, β and γ</w:t>
+      </w:r>
+    </w:p>
+    <w:p>
+      <w:pPr>
+        <w:pStyle w:val="p1"/>
+      </w:pPr>
+      <w:r>
+        <w:t>values given below. α is defined as the angle between the traverse and a-axis, β between the traverse and</w:t>
+      </w:r>
+    </w:p>
+    <w:p>
+      <w:pPr>
+        <w:pStyle w:val="p1"/>
+      </w:pPr>
+      <w:r>
+        <w:t>b-axis, and γ between the traverse and c-axis. What diffusion coefficient do you calculate? Again, make</w:t>
+      </w:r>
+    </w:p>
+    <w:p>
+      <w:pPr>
+        <w:pStyle w:val="p1"/>
+      </w:pPr>
+      <w:r>
+        <w:t>sure to provide the equation you are using, and the values for all the inputs into the equation.</w:t>
+      </w:r>
+    </w:p>
+    <w:tbl>
+      <w:tblPr>
+        <w:tblW w:w="0" w:type="auto"/>
+        <w:tblCellSpacing w:w="0" w:type="dxa"/>
+        <w:tblCellMar>
+          <w:left w:w="0" w:type="dxa"/>
+          <w:right w:w="0" w:type="dxa"/>
+        </w:tblCellMar>
+        <w:tblLook w:val="04A0" w:firstRow="1" w:lastRow="0" w:firstColumn="1" w:lastColumn="0" w:noHBand="0" w:noVBand="1"/>
+      </w:tblPr>
+      <w:tblGrid>
+        <w:gridCol w:w="251"/>
+        <w:gridCol w:w="351"/>
+        <w:gridCol w:w="301"/>
+      </w:tblGrid>
+      <w:tr>
+        <w:trPr>
+          <w:tblCellSpacing w:w="0" w:type="dxa"/>
+        </w:trPr>
+        <w:tc>
+          <w:tcPr>
+            <w:tcW w:w="0" w:type="auto"/>
+            <w:hideMark/>
+          </w:tcPr>
+          <w:p>
+            <w:pPr>
+              <w:pStyle w:val="p2"/>
+            </w:pPr>
+            <w:r>
+              <w:rPr>
+                <w:rStyle w:val="s2"/>
+                <w:rFonts w:eastAsiaTheme="majorEastAsia"/>
+              </w:rPr>
+              <w:t>α</w:t>
+            </w:r>
+            <w:r>
+              <w:rPr>
+                <w:rStyle w:val="apple-converted-space"/>
+                <w:rFonts w:ascii="Helvetica" w:eastAsiaTheme="majorEastAsia" w:hAnsi="Helvetica"/>
+                <w:sz w:val="18"/>
+                <w:szCs w:val="18"/>
+              </w:rPr>
+              <w:t> </w:t>
+            </w:r>
+          </w:p>
+        </w:tc>
+        <w:tc>
+          <w:tcPr>
+            <w:tcW w:w="0" w:type="auto"/>
+            <w:hideMark/>
+          </w:tcPr>
+          <w:p>
+            <w:pPr>
+              <w:pStyle w:val="p2"/>
+            </w:pPr>
+            <w:r>
+              <w:rPr>
+                <w:rStyle w:val="s2"/>
+                <w:rFonts w:eastAsiaTheme="majorEastAsia"/>
+              </w:rPr>
+              <w:t>β</w:t>
+            </w:r>
+            <w:r>
+              <w:rPr>
+                <w:rStyle w:val="apple-converted-space"/>
+                <w:rFonts w:ascii="Helvetica" w:eastAsiaTheme="majorEastAsia" w:hAnsi="Helvetica"/>
+                <w:sz w:val="18"/>
+                <w:szCs w:val="18"/>
+              </w:rPr>
+              <w:t> </w:t>
+            </w:r>
+          </w:p>
+        </w:tc>
+        <w:tc>
+          <w:tcPr>
+            <w:tcW w:w="0" w:type="auto"/>
+            <w:hideMark/>
+          </w:tcPr>
+          <w:p>
+            <w:pPr>
+              <w:pStyle w:val="p2"/>
+            </w:pPr>
+            <w:r>
+              <w:rPr>
+                <w:rStyle w:val="s2"/>
+                <w:rFonts w:eastAsiaTheme="majorEastAsia"/>
+              </w:rPr>
+              <w:t>γ</w:t>
+            </w:r>
+          </w:p>
+        </w:tc>
+      </w:tr>
+      <w:tr>
+        <w:trPr>
+          <w:tblCellSpacing w:w="0" w:type="dxa"/>
+        </w:trPr>
+        <w:tc>
+          <w:tcPr>
+            <w:tcW w:w="0" w:type="auto"/>
+            <w:hideMark/>
+          </w:tcPr>
+          <w:p>
+            <w:pPr>
+              <w:pStyle w:val="p2"/>
+            </w:pPr>
+            <w:r>
+              <w:rPr>
+                <w:rStyle w:val="s2"/>
+                <w:rFonts w:eastAsiaTheme="majorEastAsia"/>
+              </w:rPr>
+              <w:t>70</w:t>
+            </w:r>
+            <w:r>
+              <w:rPr>
+                <w:rStyle w:val="apple-converted-space"/>
+                <w:rFonts w:ascii="Helvetica" w:eastAsiaTheme="majorEastAsia" w:hAnsi="Helvetica"/>
+                <w:sz w:val="18"/>
+                <w:szCs w:val="18"/>
+              </w:rPr>
+              <w:t> </w:t>
+            </w:r>
+          </w:p>
+        </w:tc>
+        <w:tc>
+          <w:tcPr>
+            <w:tcW w:w="0" w:type="auto"/>
+            <w:hideMark/>
+          </w:tcPr>
+          <w:p>
+            <w:pPr>
+              <w:pStyle w:val="p2"/>
+            </w:pPr>
+            <w:r>
+              <w:rPr>
+                <w:rStyle w:val="s2"/>
+                <w:rFonts w:eastAsiaTheme="majorEastAsia"/>
+              </w:rPr>
+              <w:t>152</w:t>
+            </w:r>
+            <w:r>
+              <w:rPr>
+                <w:rStyle w:val="apple-converted-space"/>
+                <w:rFonts w:ascii="Helvetica" w:eastAsiaTheme="majorEastAsia" w:hAnsi="Helvetica"/>
+                <w:sz w:val="18"/>
+                <w:szCs w:val="18"/>
+              </w:rPr>
+              <w:t> </w:t>
+            </w:r>
+          </w:p>
+        </w:tc>
+        <w:tc>
+          <w:tcPr>
+            <w:tcW w:w="0" w:type="auto"/>
+            <w:hideMark/>
+          </w:tcPr>
+          <w:p>
+            <w:pPr>
+              <w:pStyle w:val="p2"/>
+            </w:pPr>
+            <w:r>
+              <w:rPr>
+                <w:rStyle w:val="s2"/>
+                <w:rFonts w:eastAsiaTheme="majorEastAsia"/>
+              </w:rPr>
+              <w:t>108</w:t>
+            </w:r>
+          </w:p>
+        </w:tc>
+      </w:tr>
+    </w:tbl>
+    <w:p>
+      <w:pPr>
+        <w:pStyle w:val="HTMLPreformatted"/>
+        <w:spacing w:line="225" w:lineRule="atLeast"/>
+        <w:rPr>
+          <w:rFonts w:ascii="Menlo" w:hAnsi="Menlo" w:cs="Menlo"/>
+          <w:sz w:val="18"/>
+          <w:szCs w:val="18"/>
+        </w:rPr>
+      </w:pPr>
+      <w:r>
+        <w:rPr>
+          <w:rFonts w:ascii="Menlo" w:hAnsi="Menlo" w:cs="Menlo"/>
+          <w:sz w:val="18"/>
+          <w:szCs w:val="18"/>
+        </w:rPr>
+        <w:t>1.370 * 10</w:t>
+      </w:r>
+      <w:r>
+        <w:rPr>
+          <w:rFonts w:ascii="Menlo" w:hAnsi="Menlo" w:cs="Menlo"/>
+          <w:sz w:val="18"/>
+          <w:szCs w:val="18"/>
+          <w:vertAlign w:val="superscript"/>
+        </w:rPr>
+        <w:t>-1</w:t>
+      </w:r>
+      <w:r>
+        <w:rPr>
+          <w:rFonts w:ascii="Menlo" w:hAnsi="Menlo" w:cs="Menlo"/>
+          <w:sz w:val="18"/>
+          <w:szCs w:val="18"/>
+          <w:vertAlign w:val="superscript"/>
+        </w:rPr>
+        <w:t>7</w:t>
+      </w:r>
+      <w:r>
+        <w:rPr>
+          <w:rFonts w:ascii="Menlo" w:hAnsi="Menlo" w:cs="Menlo"/>
+          <w:sz w:val="18"/>
+          <w:szCs w:val="18"/>
+        </w:rPr>
+        <w:t xml:space="preserve"> m</w:t>
+      </w:r>
+      <w:r>
+        <w:rPr>
+          <w:rFonts w:ascii="Menlo" w:hAnsi="Menlo" w:cs="Menlo"/>
+          <w:sz w:val="18"/>
+          <w:szCs w:val="18"/>
+          <w:vertAlign w:val="superscript"/>
+        </w:rPr>
+        <w:t>2</w:t>
+      </w:r>
+      <w:r>
+        <w:rPr>
+          <w:rFonts w:ascii="Menlo" w:hAnsi="Menlo" w:cs="Menlo"/>
+          <w:sz w:val="18"/>
+          <w:szCs w:val="18"/>
+        </w:rPr>
+        <w:t>/s</w:t>
+      </w:r>
+    </w:p>
+    <w:p>
+      <w:pPr>
+        <w:pStyle w:val="p3"/>
+      </w:pPr>
+    </w:p>
+    <w:p>
+      <w:pPr>
+        <w:pStyle w:val="p3"/>
+      </w:pPr>
+    </w:p>
+    <w:p>
+      <w:pPr>
+        <w:pStyle w:val="p1"/>
+      </w:pPr>
+      <w:r>
+        <w:t>1h) What log(fO</w:t>
+      </w:r>
+      <w:r>
+        <w:rPr>
+          <w:rStyle w:val="s1"/>
+          <w:rFonts w:eastAsiaTheme="majorEastAsia"/>
+        </w:rPr>
+        <w:t>2</w:t>
+      </w:r>
+      <w:r>
+        <w:t>) would you calculate for NNO+1 at 1200°C and 420 bars? Again, specify what</w:t>
+      </w:r>
+    </w:p>
+    <w:p>
+      <w:pPr>
+        <w:pStyle w:val="p1"/>
+      </w:pPr>
+      <w:r>
+        <w:t>equations you are using.</w:t>
+      </w:r>
+    </w:p>
+    <w:p>
+      <w:pPr>
+        <w:pStyle w:val="HTMLPreformatted"/>
+        <w:spacing w:line="225" w:lineRule="atLeast"/>
+        <w:rPr>
+          <w:rFonts w:ascii="Menlo" w:hAnsi="Menlo" w:cs="Menlo"/>
+          <w:sz w:val="18"/>
+          <w:szCs w:val="18"/>
+        </w:rPr>
+      </w:pPr>
+    </w:p>
+    <w:p>
+      <w:pPr>
+        <w:tabs>
+          <w:tab w:val="left" w:pos="916"/>
+          <w:tab w:val="left" w:pos="1832"/>
+          <w:tab w:val="left" w:pos="2748"/>
+          <w:tab w:val="left" w:pos="3664"/>
+          <w:tab w:val="left" w:pos="4580"/>
+          <w:tab w:val="left" w:pos="5496"/>
+          <w:tab w:val="left" w:pos="6412"/>
+          <w:tab w:val="left" w:pos="7328"/>
+          <w:tab w:val="left" w:pos="8244"/>
+          <w:tab w:val="left" w:pos="9160"/>
+          <w:tab w:val="left" w:pos="10076"/>
+          <w:tab w:val="left" w:pos="10992"/>
+          <w:tab w:val="left" w:pos="11908"/>
+          <w:tab w:val="left" w:pos="12824"/>
+          <w:tab w:val="left" w:pos="13740"/>
+          <w:tab w:val="left" w:pos="14656"/>
+        </w:tabs>
+        <w:spacing w:line="225" w:lineRule="atLeast"/>
+        <w:rPr>
+          <w:rFonts w:ascii="Menlo" w:hAnsi="Menlo" w:cs="Menlo"/>
+          <w:sz w:val="18"/>
+          <w:szCs w:val="18"/>
+        </w:rPr>
+      </w:pPr>
+      <w:r>
+        <w:rPr>
+          <w:rFonts w:ascii="Menlo" w:hAnsi="Menlo" w:cs="Menlo"/>
+          <w:sz w:val="18"/>
+          <w:szCs w:val="18"/>
+        </w:rPr>
+        <w:t>10</w:t>
+      </w:r>
+      <w:r>
+        <w:rPr>
+          <w:rFonts w:ascii="Menlo" w:hAnsi="Menlo" w:cs="Menlo"/>
+          <w:sz w:val="18"/>
+          <w:szCs w:val="18"/>
+          <w:vertAlign w:val="superscript"/>
+        </w:rPr>
+        <w:t>-7.869</w:t>
+      </w:r>
+      <w:r>
+        <w:rPr>
+          <w:rFonts w:ascii="Menlo" w:hAnsi="Menlo" w:cs="Menlo"/>
+          <w:sz w:val="18"/>
+          <w:szCs w:val="18"/>
+        </w:rPr>
+        <w:t xml:space="preserve"> Bar</w:t>
+      </w:r>
+      <w:r>
+        <w:rPr>
+          <w:rFonts w:ascii="Menlo" w:hAnsi="Menlo" w:cs="Menlo"/>
+          <w:sz w:val="18"/>
+          <w:szCs w:val="18"/>
+        </w:rPr>
+        <w:t xml:space="preserve">. Using equations from Frost 1991 reviews in Mineralogy Volume 25. </w:t>
+      </w:r>
+    </w:p>
+    <w:p>
+      <w:pPr>
+        <w:tabs>
+          <w:tab w:val="left" w:pos="916"/>
+          <w:tab w:val="left" w:pos="1832"/>
+          <w:tab w:val="left" w:pos="2748"/>
+          <w:tab w:val="left" w:pos="3664"/>
+          <w:tab w:val="left" w:pos="4580"/>
+          <w:tab w:val="left" w:pos="5496"/>
+          <w:tab w:val="left" w:pos="6412"/>
+          <w:tab w:val="left" w:pos="7328"/>
+          <w:tab w:val="left" w:pos="8244"/>
+          <w:tab w:val="left" w:pos="9160"/>
+          <w:tab w:val="left" w:pos="10076"/>
+          <w:tab w:val="left" w:pos="10992"/>
+          <w:tab w:val="left" w:pos="11908"/>
+          <w:tab w:val="left" w:pos="12824"/>
+          <w:tab w:val="left" w:pos="13740"/>
+          <w:tab w:val="left" w:pos="14656"/>
+        </w:tabs>
+        <w:spacing w:line="225" w:lineRule="atLeast"/>
+        <w:rPr>
+          <w:rFonts w:ascii="Menlo" w:hAnsi="Menlo" w:cs="Menlo"/>
+          <w:sz w:val="18"/>
+          <w:szCs w:val="18"/>
+        </w:rPr>
+      </w:pPr>
+      <w:r>
+        <w:rPr>
+          <w:rFonts w:ascii="Menlo" w:hAnsi="Menlo" w:cs="Menlo"/>
+          <w:sz w:val="18"/>
+          <w:szCs w:val="18"/>
+        </w:rPr>
+        <w:t xml:space="preserve">Code provided in attached python sheets. </w:t>
+      </w:r>
+    </w:p>
+    <w:p>
+      <w:pPr>
+        <w:pStyle w:val="HTMLPreformatted"/>
+        <w:spacing w:line="225" w:lineRule="atLeast"/>
+        <w:rPr>
+          <w:rFonts w:ascii="Menlo" w:hAnsi="Menlo" w:cs="Menlo"/>
+          <w:sz w:val="18"/>
+          <w:szCs w:val="18"/>
+        </w:rPr>
+      </w:pPr>
+    </w:p>
+    <w:p>
+      <w:pPr>
+        <w:pStyle w:val="HTMLPreformatted"/>
+        <w:spacing w:line="225" w:lineRule="atLeast"/>
+        <w:rPr>
+          <w:rFonts w:ascii="Menlo" w:hAnsi="Menlo" w:cs="Menlo"/>
+          <w:sz w:val="18"/>
+          <w:szCs w:val="18"/>
+        </w:rPr>
+      </w:pPr>
+    </w:p>
+    <w:p>
+      <w:pPr>
+        <w:pStyle w:val="HTMLPreformatted"/>
+        <w:spacing w:line="225" w:lineRule="atLeast"/>
+        <w:rPr>
+          <w:rFonts w:ascii="Menlo" w:hAnsi="Menlo" w:cs="Menlo"/>
+          <w:sz w:val="18"/>
+          <w:szCs w:val="18"/>
+        </w:rPr>
+      </w:pPr>
+    </w:p>
+    <w:p>
+      <w:pPr>
+        <w:pStyle w:val="HTMLPreformatted"/>
+        <w:spacing w:line="225" w:lineRule="atLeast"/>
+        <w:rPr>
+          <w:rFonts w:ascii="Menlo" w:hAnsi="Menlo" w:cs="Menlo"/>
+          <w:sz w:val="18"/>
+          <w:szCs w:val="18"/>
+        </w:rPr>
+      </w:pPr>
+    </w:p>
+    <w:p>
+      <w:pPr>
+        <w:pStyle w:val="HTMLPreformatted"/>
+        <w:spacing w:line="225" w:lineRule="atLeast"/>
+        <w:rPr>
+          <w:rFonts w:ascii="Menlo" w:hAnsi="Menlo" w:cs="Menlo"/>
+          <w:sz w:val="18"/>
+          <w:szCs w:val="18"/>
+        </w:rPr>
+      </w:pPr>
+    </w:p>
+    <w:p>
+      <w:pPr>
+        <w:pStyle w:val="HTMLPreformatted"/>
+        <w:spacing w:line="225" w:lineRule="atLeast"/>
+        <w:rPr>
+          <w:rFonts w:ascii="Menlo" w:hAnsi="Menlo" w:cs="Menlo"/>
+          <w:sz w:val="18"/>
+          <w:szCs w:val="18"/>
+        </w:rPr>
+      </w:pPr>
+    </w:p>
+    <w:p>
+      <w:pPr>
+        <w:pStyle w:val="HTMLPreformatted"/>
+        <w:spacing w:line="225" w:lineRule="atLeast"/>
+        <w:rPr>
+          <w:rFonts w:ascii="Menlo" w:hAnsi="Menlo" w:cs="Menlo"/>
+          <w:sz w:val="18"/>
+          <w:szCs w:val="18"/>
+        </w:rPr>
+      </w:pPr>
+    </w:p>
+    <w:p>
+      <w:pPr>
+        <w:pStyle w:val="HTMLPreformatted"/>
+        <w:spacing w:line="225" w:lineRule="atLeast"/>
+        <w:rPr>
+          <w:rFonts w:ascii="Menlo" w:hAnsi="Menlo" w:cs="Menlo"/>
+          <w:sz w:val="18"/>
+          <w:szCs w:val="18"/>
+        </w:rPr>
+      </w:pPr>
+    </w:p>
+    <w:p>
+      <w:pPr>
+        <w:pStyle w:val="p1"/>
+      </w:pPr>
+      <w:r>
+        <w:t>2a) Fit the profile in tab ‘2A’ of the attached excel sheet using the following conditions (also provided in</w:t>
+      </w:r>
+    </w:p>
+    <w:p>
+      <w:pPr>
+        <w:pStyle w:val="p1"/>
+      </w:pPr>
+      <w:r>
+        <w:t>Excel): 1200±30°C, 42±10 MPa, log(fO</w:t>
+      </w:r>
+      <w:r>
+        <w:rPr>
+          <w:rStyle w:val="s1"/>
+          <w:rFonts w:eastAsiaTheme="majorEastAsia"/>
+        </w:rPr>
+        <w:t>2</w:t>
+      </w:r>
+      <w:r>
+        <w:t>) = -7.86±0.2 in bars, and α=88°, β=123°, and γ=33°</w:t>
+      </w:r>
+      <w:r>
+        <w:t>.</w:t>
+      </w:r>
+      <w:r>
+        <w:t xml:space="preserve"> Set the step</w:t>
+      </w:r>
+    </w:p>
+    <w:p>
+      <w:pPr>
+        <w:pStyle w:val="p1"/>
+      </w:pPr>
+      <w:r>
+        <w:t>change between 51 and 41 µm (51 µm has the core value and 41 µm has the rim value, or however your</w:t>
+      </w:r>
+    </w:p>
+    <w:p>
+      <w:pPr>
+        <w:pStyle w:val="p1"/>
+      </w:pPr>
+      <w:r>
+        <w:t>model specifies this), and the core and rim concentrations respectively at Fo82 and Fo88.5. Please provide</w:t>
+      </w:r>
+    </w:p>
+    <w:p>
+      <w:pPr>
+        <w:pStyle w:val="p1"/>
+      </w:pPr>
+      <w:r>
+        <w:t>the resultant timescale with an uncertainty. Please additionally provide the fit profile and a figure of your</w:t>
+      </w:r>
+    </w:p>
+    <w:p>
+      <w:pPr>
+        <w:pStyle w:val="p1"/>
+      </w:pPr>
+      <w:r>
+        <w:t>fit.</w:t>
+      </w:r>
+    </w:p>
+    <w:p>
+      <w:pPr>
+        <w:pStyle w:val="p1"/>
+      </w:pPr>
+    </w:p>
+    <w:p>
+      <w:pPr>
+        <w:pStyle w:val="p1"/>
+      </w:pPr>
+      <w:r>
+        <w:t xml:space="preserve">My model fit puts the best fit a time round 28 days +/- 3 days Assuming a step position of 42µm. </w:t>
+      </w:r>
+    </w:p>
+    <w:p>
+      <w:pPr>
+        <w:pStyle w:val="HTMLPreformatted"/>
+        <w:spacing w:line="225" w:lineRule="atLeast"/>
+        <w:rPr>
+          <w:rFonts w:ascii="Menlo" w:hAnsi="Menlo" w:cs="Menlo"/>
+          <w:sz w:val="18"/>
+          <w:szCs w:val="18"/>
+        </w:rPr>
+      </w:pPr>
+    </w:p>
     <w:p/>
     <w:p/>
     <w:p/>
     <w:p/>
-    <w:p>
-      <w:r>
-        <w:t>Model 2A</w:t>
-      </w:r>
-    </w:p>
-    <w:p>
-      <w:r>
-        <w:t>Step at 46µm</w:t>
-      </w:r>
-    </w:p>
-    <w:p>
-      <w:r>
+    <w:p/>
+    <w:p/>
+    <w:p>
+      <w:r>
+        <w:rPr>
+          <w:noProof/>
+          <w14:ligatures w14:val="standardContextual"/>
+        </w:rPr>
+        <w:lastRenderedPageBreak/>
         <w:drawing>
-          <wp:inline distT="0" distB="0" distL="0" distR="0" wp14:anchorId="6820673E" wp14:editId="42F3C935">
-            <wp:extent cx="5080000" cy="4813300"/>
-            <wp:effectExtent l="0" t="0" r="0" b="0"/>
-            <wp:docPr id="1959120928" name="Picture 1" descr="A graph of a temperature&#10;&#10;AI-generated content may be incorrect."/>
+          <wp:inline distT="0" distB="0" distL="0" distR="0" wp14:anchorId="73F0CA29" wp14:editId="731A2DB6">
+            <wp:extent cx="5943600" cy="6259195"/>
+            <wp:effectExtent l="0" t="0" r="0" b="1905"/>
+            <wp:docPr id="1089042691" name="Picture 7" descr="A table of numbers and a number&#10;&#10;AI-generated content may be incorrect."/>
             <wp:cNvGraphicFramePr>
               <a:graphicFrameLocks xmlns:a="http://schemas.openxmlformats.org/drawingml/2006/main" noChangeAspect="1"/>
             </wp:cNvGraphicFramePr>
@@ -86,11 +1707,17 @@
               <a:graphicData uri="http://schemas.openxmlformats.org/drawingml/2006/picture">
                 <pic:pic xmlns:pic="http://schemas.openxmlformats.org/drawingml/2006/picture">
                   <pic:nvPicPr>
-                    <pic:cNvPr id="1959120928" name="Picture 1" descr="A graph of a temperature&#10;&#10;AI-generated content may be incorrect."/>
+                    <pic:cNvPr id="1089042691" name="Picture 7" descr="A table of numbers and a number&#10;&#10;AI-generated content may be incorrect."/>
                     <pic:cNvPicPr/>
                   </pic:nvPicPr>
                   <pic:blipFill>
-                    <a:blip r:embed="rId4"/>
+                    <a:blip r:embed="rId4" cstate="print">
+                      <a:extLst>
+                        <a:ext uri="{28A0092B-C50C-407E-A947-70E740481C1C}">
+                          <a14:useLocalDpi xmlns:a14="http://schemas.microsoft.com/office/drawing/2010/main" val="0"/>
+                        </a:ext>
+                      </a:extLst>
+                    </a:blip>
                     <a:stretch>
                       <a:fillRect/>
                     </a:stretch>
@@ -98,7 +1725,7 @@
                   <pic:spPr>
                     <a:xfrm>
                       <a:off x="0" y="0"/>
-                      <a:ext cx="5080000" cy="4813300"/>
+                      <a:ext cx="5943600" cy="6259195"/>
                     </a:xfrm>
                     <a:prstGeom prst="rect">
                       <a:avLst/>
@@ -111,20 +1738,18 @@
         </w:drawing>
       </w:r>
     </w:p>
-    <w:p/>
-    <w:p>
-      <w:r>
-        <w:t>Step at 41µm</w:t>
-      </w:r>
-    </w:p>
-    <w:p>
-      <w:r>
+    <w:p>
+      <w:r>
+        <w:rPr>
+          <w:noProof/>
+          <w14:ligatures w14:val="standardContextual"/>
+        </w:rPr>
         <w:lastRenderedPageBreak/>
         <w:drawing>
-          <wp:inline distT="0" distB="0" distL="0" distR="0" wp14:anchorId="7E886E0C" wp14:editId="441F3714">
-            <wp:extent cx="5080000" cy="4813300"/>
+          <wp:inline distT="0" distB="0" distL="0" distR="0" wp14:anchorId="39D2DB63" wp14:editId="161ADD79">
+            <wp:extent cx="5943600" cy="3962400"/>
             <wp:effectExtent l="0" t="0" r="0" b="0"/>
-            <wp:docPr id="557503802" name="Picture 1" descr="A graph of a temperature&#10;&#10;AI-generated content may be incorrect."/>
+            <wp:docPr id="1568669978" name="Picture 7" descr="A graph of a temperature&#10;&#10;AI-generated content may be incorrect."/>
             <wp:cNvGraphicFramePr>
               <a:graphicFrameLocks xmlns:a="http://schemas.openxmlformats.org/drawingml/2006/main" noChangeAspect="1"/>
             </wp:cNvGraphicFramePr>
@@ -132,11 +1757,17 @@
               <a:graphicData uri="http://schemas.openxmlformats.org/drawingml/2006/picture">
                 <pic:pic xmlns:pic="http://schemas.openxmlformats.org/drawingml/2006/picture">
                   <pic:nvPicPr>
-                    <pic:cNvPr id="557503802" name="Picture 1" descr="A graph of a temperature&#10;&#10;AI-generated content may be incorrect."/>
+                    <pic:cNvPr id="1568669978" name="Picture 7" descr="A graph of a temperature&#10;&#10;AI-generated content may be incorrect."/>
                     <pic:cNvPicPr/>
                   </pic:nvPicPr>
                   <pic:blipFill>
-                    <a:blip r:embed="rId5"/>
+                    <a:blip r:embed="rId5">
+                      <a:extLst>
+                        <a:ext uri="{28A0092B-C50C-407E-A947-70E740481C1C}">
+                          <a14:useLocalDpi xmlns:a14="http://schemas.microsoft.com/office/drawing/2010/main" val="0"/>
+                        </a:ext>
+                      </a:extLst>
+                    </a:blip>
                     <a:stretch>
                       <a:fillRect/>
                     </a:stretch>
@@ -144,7 +1775,7 @@
                   <pic:spPr>
                     <a:xfrm>
                       <a:off x="0" y="0"/>
-                      <a:ext cx="5080000" cy="4813300"/>
+                      <a:ext cx="5943600" cy="3962400"/>
                     </a:xfrm>
                     <a:prstGeom prst="rect">
                       <a:avLst/>
@@ -156,22 +1787,16 @@
           </wp:inline>
         </w:drawing>
       </w:r>
-    </w:p>
-    <w:p>
-      <w:r>
-        <w:t>Step at 51µm</w:t>
-      </w:r>
-    </w:p>
-    <w:p/>
-    <w:p/>
-    <w:p>
-      <w:r>
-        <w:lastRenderedPageBreak/>
+      <w:r>
+        <w:rPr>
+          <w:noProof/>
+          <w14:ligatures w14:val="standardContextual"/>
+        </w:rPr>
         <w:drawing>
-          <wp:inline distT="0" distB="0" distL="0" distR="0" wp14:anchorId="7B01835A" wp14:editId="5070B80F">
-            <wp:extent cx="5080000" cy="4813300"/>
+          <wp:inline distT="0" distB="0" distL="0" distR="0" wp14:anchorId="72C52445" wp14:editId="1FAF1B83">
+            <wp:extent cx="5943600" cy="3962400"/>
             <wp:effectExtent l="0" t="0" r="0" b="0"/>
-            <wp:docPr id="2058501413" name="Picture 1" descr="A graph of a temperature&#10;&#10;AI-generated content may be incorrect."/>
+            <wp:docPr id="898652710" name="Picture 8" descr="A graph of a temperature&#10;&#10;AI-generated content may be incorrect."/>
             <wp:cNvGraphicFramePr>
               <a:graphicFrameLocks xmlns:a="http://schemas.openxmlformats.org/drawingml/2006/main" noChangeAspect="1"/>
             </wp:cNvGraphicFramePr>
@@ -179,11 +1804,17 @@
               <a:graphicData uri="http://schemas.openxmlformats.org/drawingml/2006/picture">
                 <pic:pic xmlns:pic="http://schemas.openxmlformats.org/drawingml/2006/picture">
                   <pic:nvPicPr>
-                    <pic:cNvPr id="2058501413" name="Picture 1" descr="A graph of a temperature&#10;&#10;AI-generated content may be incorrect."/>
+                    <pic:cNvPr id="898652710" name="Picture 8" descr="A graph of a temperature&#10;&#10;AI-generated content may be incorrect."/>
                     <pic:cNvPicPr/>
                   </pic:nvPicPr>
                   <pic:blipFill>
-                    <a:blip r:embed="rId6"/>
+                    <a:blip r:embed="rId6">
+                      <a:extLst>
+                        <a:ext uri="{28A0092B-C50C-407E-A947-70E740481C1C}">
+                          <a14:useLocalDpi xmlns:a14="http://schemas.microsoft.com/office/drawing/2010/main" val="0"/>
+                        </a:ext>
+                      </a:extLst>
+                    </a:blip>
                     <a:stretch>
                       <a:fillRect/>
                     </a:stretch>
@@ -191,7 +1822,7 @@
                   <pic:spPr>
                     <a:xfrm>
                       <a:off x="0" y="0"/>
-                      <a:ext cx="5080000" cy="4813300"/>
+                      <a:ext cx="5943600" cy="3962400"/>
                     </a:xfrm>
                     <a:prstGeom prst="rect">
                       <a:avLst/>
@@ -203,7 +1834,103 @@
           </wp:inline>
         </w:drawing>
       </w:r>
-    </w:p>
+      <w:r>
+        <w:rPr>
+          <w:noProof/>
+          <w14:ligatures w14:val="standardContextual"/>
+        </w:rPr>
+        <w:lastRenderedPageBreak/>
+        <w:drawing>
+          <wp:inline distT="0" distB="0" distL="0" distR="0" wp14:anchorId="588BD052" wp14:editId="4B1A562D">
+            <wp:extent cx="5943600" cy="3962400"/>
+            <wp:effectExtent l="0" t="0" r="0" b="0"/>
+            <wp:docPr id="1863214361" name="Picture 9"/>
+            <wp:cNvGraphicFramePr>
+              <a:graphicFrameLocks xmlns:a="http://schemas.openxmlformats.org/drawingml/2006/main" noChangeAspect="1"/>
+            </wp:cNvGraphicFramePr>
+            <a:graphic xmlns:a="http://schemas.openxmlformats.org/drawingml/2006/main">
+              <a:graphicData uri="http://schemas.openxmlformats.org/drawingml/2006/picture">
+                <pic:pic xmlns:pic="http://schemas.openxmlformats.org/drawingml/2006/picture">
+                  <pic:nvPicPr>
+                    <pic:cNvPr id="1863214361" name="Picture 1863214361"/>
+                    <pic:cNvPicPr/>
+                  </pic:nvPicPr>
+                  <pic:blipFill>
+                    <a:blip r:embed="rId7">
+                      <a:extLst>
+                        <a:ext uri="{28A0092B-C50C-407E-A947-70E740481C1C}">
+                          <a14:useLocalDpi xmlns:a14="http://schemas.microsoft.com/office/drawing/2010/main" val="0"/>
+                        </a:ext>
+                      </a:extLst>
+                    </a:blip>
+                    <a:stretch>
+                      <a:fillRect/>
+                    </a:stretch>
+                  </pic:blipFill>
+                  <pic:spPr>
+                    <a:xfrm>
+                      <a:off x="0" y="0"/>
+                      <a:ext cx="5943600" cy="3962400"/>
+                    </a:xfrm>
+                    <a:prstGeom prst="rect">
+                      <a:avLst/>
+                    </a:prstGeom>
+                  </pic:spPr>
+                </pic:pic>
+              </a:graphicData>
+            </a:graphic>
+          </wp:inline>
+        </w:drawing>
+      </w:r>
+      <w:r>
+        <w:rPr>
+          <w:noProof/>
+          <w14:ligatures w14:val="standardContextual"/>
+        </w:rPr>
+        <w:drawing>
+          <wp:inline distT="0" distB="0" distL="0" distR="0" wp14:anchorId="32D879FA" wp14:editId="1BBF3F0B">
+            <wp:extent cx="5943600" cy="3962400"/>
+            <wp:effectExtent l="0" t="0" r="0" b="0"/>
+            <wp:docPr id="1010432799" name="Picture 10" descr="A graph of a temperature&#10;&#10;AI-generated content may be incorrect."/>
+            <wp:cNvGraphicFramePr>
+              <a:graphicFrameLocks xmlns:a="http://schemas.openxmlformats.org/drawingml/2006/main" noChangeAspect="1"/>
+            </wp:cNvGraphicFramePr>
+            <a:graphic xmlns:a="http://schemas.openxmlformats.org/drawingml/2006/main">
+              <a:graphicData uri="http://schemas.openxmlformats.org/drawingml/2006/picture">
+                <pic:pic xmlns:pic="http://schemas.openxmlformats.org/drawingml/2006/picture">
+                  <pic:nvPicPr>
+                    <pic:cNvPr id="1010432799" name="Picture 10" descr="A graph of a temperature&#10;&#10;AI-generated content may be incorrect."/>
+                    <pic:cNvPicPr/>
+                  </pic:nvPicPr>
+                  <pic:blipFill>
+                    <a:blip r:embed="rId8">
+                      <a:extLst>
+                        <a:ext uri="{28A0092B-C50C-407E-A947-70E740481C1C}">
+                          <a14:useLocalDpi xmlns:a14="http://schemas.microsoft.com/office/drawing/2010/main" val="0"/>
+                        </a:ext>
+                      </a:extLst>
+                    </a:blip>
+                    <a:stretch>
+                      <a:fillRect/>
+                    </a:stretch>
+                  </pic:blipFill>
+                  <pic:spPr>
+                    <a:xfrm>
+                      <a:off x="0" y="0"/>
+                      <a:ext cx="5943600" cy="3962400"/>
+                    </a:xfrm>
+                    <a:prstGeom prst="rect">
+                      <a:avLst/>
+                    </a:prstGeom>
+                  </pic:spPr>
+                </pic:pic>
+              </a:graphicData>
+            </a:graphic>
+          </wp:inline>
+        </w:drawing>
+      </w:r>
+    </w:p>
+    <w:p/>
     <w:sectPr>
       <w:pgSz w:w="12240" w:h="15840"/>
       <w:pgMar w:top="1440" w:right="1440" w:bottom="1440" w:left="1440" w:header="720" w:footer="720" w:gutter="0"/>
@@ -614,6 +2341,15 @@
   <w:style w:type="paragraph" w:default="1" w:styleId="Normal">
     <w:name w:val="Normal"/>
     <w:qFormat/>
+    <w:rsid w:val="00482CCE"/>
+    <w:pPr>
+      <w:spacing w:after="0" w:line="240" w:lineRule="auto"/>
+    </w:pPr>
+    <w:rPr>
+      <w:rFonts w:ascii="Times New Roman" w:eastAsia="Times New Roman" w:hAnsi="Times New Roman" w:cs="Times New Roman"/>
+      <w:kern w:val="0"/>
+      <w14:ligatures w14:val="none"/>
+    </w:rPr>
   </w:style>
   <w:style w:type="paragraph" w:styleId="Heading1">
     <w:name w:val="heading 1"/>
@@ -626,14 +2362,16 @@
     <w:pPr>
       <w:keepNext/>
       <w:keepLines/>
-      <w:spacing w:before="360" w:after="80"/>
+      <w:spacing w:before="360" w:after="80" w:line="278" w:lineRule="auto"/>
       <w:outlineLvl w:val="0"/>
     </w:pPr>
     <w:rPr>
       <w:rFonts w:asciiTheme="majorHAnsi" w:eastAsiaTheme="majorEastAsia" w:hAnsiTheme="majorHAnsi" w:cstheme="majorBidi"/>
       <w:color w:val="0F4761" w:themeColor="accent1" w:themeShade="BF"/>
+      <w:kern w:val="2"/>
       <w:sz w:val="40"/>
       <w:szCs w:val="40"/>
+      <w14:ligatures w14:val="standardContextual"/>
     </w:rPr>
   </w:style>
   <w:style w:type="paragraph" w:styleId="Heading2">
@@ -649,14 +2387,16 @@
     <w:pPr>
       <w:keepNext/>
       <w:keepLines/>
-      <w:spacing w:before="160" w:after="80"/>
+      <w:spacing w:before="160" w:after="80" w:line="278" w:lineRule="auto"/>
       <w:outlineLvl w:val="1"/>
     </w:pPr>
     <w:rPr>
       <w:rFonts w:asciiTheme="majorHAnsi" w:eastAsiaTheme="majorEastAsia" w:hAnsiTheme="majorHAnsi" w:cstheme="majorBidi"/>
       <w:color w:val="0F4761" w:themeColor="accent1" w:themeShade="BF"/>
+      <w:kern w:val="2"/>
       <w:sz w:val="32"/>
       <w:szCs w:val="32"/>
+      <w14:ligatures w14:val="standardContextual"/>
     </w:rPr>
   </w:style>
   <w:style w:type="paragraph" w:styleId="Heading3">
@@ -672,14 +2412,16 @@
     <w:pPr>
       <w:keepNext/>
       <w:keepLines/>
-      <w:spacing w:before="160" w:after="80"/>
+      <w:spacing w:before="160" w:after="80" w:line="278" w:lineRule="auto"/>
       <w:outlineLvl w:val="2"/>
     </w:pPr>
     <w:rPr>
-      <w:rFonts w:eastAsiaTheme="majorEastAsia" w:cstheme="majorBidi"/>
+      <w:rFonts w:asciiTheme="minorHAnsi" w:eastAsiaTheme="majorEastAsia" w:hAnsiTheme="minorHAnsi" w:cstheme="majorBidi"/>
       <w:color w:val="0F4761" w:themeColor="accent1" w:themeShade="BF"/>
+      <w:kern w:val="2"/>
       <w:sz w:val="28"/>
       <w:szCs w:val="28"/>
+      <w14:ligatures w14:val="standardContextual"/>
     </w:rPr>
   </w:style>
   <w:style w:type="paragraph" w:styleId="Heading4">
@@ -695,14 +2437,16 @@
     <w:pPr>
       <w:keepNext/>
       <w:keepLines/>
-      <w:spacing w:before="80" w:after="40"/>
+      <w:spacing w:before="80" w:after="40" w:line="278" w:lineRule="auto"/>
       <w:outlineLvl w:val="3"/>
     </w:pPr>
     <w:rPr>
-      <w:rFonts w:eastAsiaTheme="majorEastAsia" w:cstheme="majorBidi"/>
+      <w:rFonts w:asciiTheme="minorHAnsi" w:eastAsiaTheme="majorEastAsia" w:hAnsiTheme="minorHAnsi" w:cstheme="majorBidi"/>
       <w:i/>
       <w:iCs/>
       <w:color w:val="0F4761" w:themeColor="accent1" w:themeShade="BF"/>
+      <w:kern w:val="2"/>
+      <w14:ligatures w14:val="standardContextual"/>
     </w:rPr>
   </w:style>
   <w:style w:type="paragraph" w:styleId="Heading5">
@@ -718,12 +2462,14 @@
     <w:pPr>
       <w:keepNext/>
       <w:keepLines/>
-      <w:spacing w:before="80" w:after="40"/>
+      <w:spacing w:before="80" w:after="40" w:line="278" w:lineRule="auto"/>
       <w:outlineLvl w:val="4"/>
     </w:pPr>
     <w:rPr>
-      <w:rFonts w:eastAsiaTheme="majorEastAsia" w:cstheme="majorBidi"/>
+      <w:rFonts w:asciiTheme="minorHAnsi" w:eastAsiaTheme="majorEastAsia" w:hAnsiTheme="minorHAnsi" w:cstheme="majorBidi"/>
       <w:color w:val="0F4761" w:themeColor="accent1" w:themeShade="BF"/>
+      <w:kern w:val="2"/>
+      <w14:ligatures w14:val="standardContextual"/>
     </w:rPr>
   </w:style>
   <w:style w:type="paragraph" w:styleId="Heading6">
@@ -739,14 +2485,16 @@
     <w:pPr>
       <w:keepNext/>
       <w:keepLines/>
-      <w:spacing w:before="40" w:after="0"/>
+      <w:spacing w:before="40" w:line="278" w:lineRule="auto"/>
       <w:outlineLvl w:val="5"/>
     </w:pPr>
     <w:rPr>
-      <w:rFonts w:eastAsiaTheme="majorEastAsia" w:cstheme="majorBidi"/>
+      <w:rFonts w:asciiTheme="minorHAnsi" w:eastAsiaTheme="majorEastAsia" w:hAnsiTheme="minorHAnsi" w:cstheme="majorBidi"/>
       <w:i/>
       <w:iCs/>
       <w:color w:val="595959" w:themeColor="text1" w:themeTint="A6"/>
+      <w:kern w:val="2"/>
+      <w14:ligatures w14:val="standardContextual"/>
     </w:rPr>
   </w:style>
   <w:style w:type="paragraph" w:styleId="Heading7">
@@ -762,12 +2510,14 @@
     <w:pPr>
       <w:keepNext/>
       <w:keepLines/>
-      <w:spacing w:before="40" w:after="0"/>
+      <w:spacing w:before="40" w:line="278" w:lineRule="auto"/>
       <w:outlineLvl w:val="6"/>
     </w:pPr>
     <w:rPr>
-      <w:rFonts w:eastAsiaTheme="majorEastAsia" w:cstheme="majorBidi"/>
+      <w:rFonts w:asciiTheme="minorHAnsi" w:eastAsiaTheme="majorEastAsia" w:hAnsiTheme="minorHAnsi" w:cstheme="majorBidi"/>
       <w:color w:val="595959" w:themeColor="text1" w:themeTint="A6"/>
+      <w:kern w:val="2"/>
+      <w14:ligatures w14:val="standardContextual"/>
     </w:rPr>
   </w:style>
   <w:style w:type="paragraph" w:styleId="Heading8">
@@ -783,14 +2533,16 @@
     <w:pPr>
       <w:keepNext/>
       <w:keepLines/>
-      <w:spacing w:after="0"/>
+      <w:spacing w:line="278" w:lineRule="auto"/>
       <w:outlineLvl w:val="7"/>
     </w:pPr>
     <w:rPr>
-      <w:rFonts w:eastAsiaTheme="majorEastAsia" w:cstheme="majorBidi"/>
+      <w:rFonts w:asciiTheme="minorHAnsi" w:eastAsiaTheme="majorEastAsia" w:hAnsiTheme="minorHAnsi" w:cstheme="majorBidi"/>
       <w:i/>
       <w:iCs/>
       <w:color w:val="272727" w:themeColor="text1" w:themeTint="D8"/>
+      <w:kern w:val="2"/>
+      <w14:ligatures w14:val="standardContextual"/>
     </w:rPr>
   </w:style>
   <w:style w:type="paragraph" w:styleId="Heading9">
@@ -806,12 +2558,14 @@
     <w:pPr>
       <w:keepNext/>
       <w:keepLines/>
-      <w:spacing w:after="0"/>
+      <w:spacing w:line="278" w:lineRule="auto"/>
       <w:outlineLvl w:val="8"/>
     </w:pPr>
     <w:rPr>
-      <w:rFonts w:eastAsiaTheme="majorEastAsia" w:cstheme="majorBidi"/>
+      <w:rFonts w:asciiTheme="minorHAnsi" w:eastAsiaTheme="majorEastAsia" w:hAnsiTheme="minorHAnsi" w:cstheme="majorBidi"/>
       <w:color w:val="272727" w:themeColor="text1" w:themeTint="D8"/>
+      <w:kern w:val="2"/>
+      <w14:ligatures w14:val="standardContextual"/>
     </w:rPr>
   </w:style>
   <w:style w:type="character" w:default="1" w:styleId="DefaultParagraphFont">
@@ -969,7 +2723,7 @@
     <w:qFormat/>
     <w:rsid w:val="00EB685C"/>
     <w:pPr>
-      <w:spacing w:after="80" w:line="240" w:lineRule="auto"/>
+      <w:spacing w:after="80"/>
       <w:contextualSpacing/>
     </w:pPr>
     <w:rPr>
@@ -978,6 +2732,7 @@
       <w:kern w:val="28"/>
       <w:sz w:val="56"/>
       <w:szCs w:val="56"/>
+      <w14:ligatures w14:val="standardContextual"/>
     </w:rPr>
   </w:style>
   <w:style w:type="character" w:customStyle="1" w:styleId="TitleChar">
@@ -1006,13 +2761,16 @@
       <w:numPr>
         <w:ilvl w:val="1"/>
       </w:numPr>
+      <w:spacing w:after="160" w:line="278" w:lineRule="auto"/>
     </w:pPr>
     <w:rPr>
-      <w:rFonts w:eastAsiaTheme="majorEastAsia" w:cstheme="majorBidi"/>
+      <w:rFonts w:asciiTheme="minorHAnsi" w:eastAsiaTheme="majorEastAsia" w:hAnsiTheme="minorHAnsi" w:cstheme="majorBidi"/>
       <w:color w:val="595959" w:themeColor="text1" w:themeTint="A6"/>
       <w:spacing w:val="15"/>
+      <w:kern w:val="2"/>
       <w:sz w:val="28"/>
       <w:szCs w:val="28"/>
+      <w14:ligatures w14:val="standardContextual"/>
     </w:rPr>
   </w:style>
   <w:style w:type="character" w:customStyle="1" w:styleId="SubtitleChar">
@@ -1038,13 +2796,16 @@
     <w:qFormat/>
     <w:rsid w:val="00EB685C"/>
     <w:pPr>
-      <w:spacing w:before="160"/>
+      <w:spacing w:before="160" w:after="160" w:line="278" w:lineRule="auto"/>
       <w:jc w:val="center"/>
     </w:pPr>
     <w:rPr>
+      <w:rFonts w:asciiTheme="minorHAnsi" w:eastAsiaTheme="minorHAnsi" w:hAnsiTheme="minorHAnsi" w:cstheme="minorBidi"/>
       <w:i/>
       <w:iCs/>
       <w:color w:val="404040" w:themeColor="text1" w:themeTint="BF"/>
+      <w:kern w:val="2"/>
+      <w14:ligatures w14:val="standardContextual"/>
     </w:rPr>
   </w:style>
   <w:style w:type="character" w:customStyle="1" w:styleId="QuoteChar">
@@ -1066,9 +2827,15 @@
     <w:qFormat/>
     <w:rsid w:val="00EB685C"/>
     <w:pPr>
+      <w:spacing w:after="160" w:line="278" w:lineRule="auto"/>
       <w:ind w:left="720"/>
       <w:contextualSpacing/>
     </w:pPr>
+    <w:rPr>
+      <w:rFonts w:asciiTheme="minorHAnsi" w:eastAsiaTheme="minorHAnsi" w:hAnsiTheme="minorHAnsi" w:cstheme="minorBidi"/>
+      <w:kern w:val="2"/>
+      <w14:ligatures w14:val="standardContextual"/>
+    </w:rPr>
   </w:style>
   <w:style w:type="character" w:styleId="IntenseEmphasis">
     <w:name w:val="Intense Emphasis"/>
@@ -1095,14 +2862,17 @@
         <w:top w:val="single" w:sz="4" w:space="10" w:color="0F4761" w:themeColor="accent1" w:themeShade="BF"/>
         <w:bottom w:val="single" w:sz="4" w:space="10" w:color="0F4761" w:themeColor="accent1" w:themeShade="BF"/>
       </w:pBdr>
-      <w:spacing w:before="360" w:after="360"/>
+      <w:spacing w:before="360" w:after="360" w:line="278" w:lineRule="auto"/>
       <w:ind w:left="864" w:right="864"/>
       <w:jc w:val="center"/>
     </w:pPr>
     <w:rPr>
+      <w:rFonts w:asciiTheme="minorHAnsi" w:eastAsiaTheme="minorHAnsi" w:hAnsiTheme="minorHAnsi" w:cstheme="minorBidi"/>
       <w:i/>
       <w:iCs/>
       <w:color w:val="0F4761" w:themeColor="accent1" w:themeShade="BF"/>
+      <w:kern w:val="2"/>
+      <w14:ligatures w14:val="standardContextual"/>
     </w:rPr>
   </w:style>
   <w:style w:type="character" w:customStyle="1" w:styleId="IntenseQuoteChar">
@@ -1135,16 +2905,10 @@
     <w:name w:val="p1"/>
     <w:basedOn w:val="Normal"/>
     <w:rsid w:val="002714B9"/>
-    <w:pPr>
-      <w:spacing w:after="0" w:line="240" w:lineRule="auto"/>
-    </w:pPr>
-    <w:rPr>
-      <w:rFonts w:ascii="Times New Roman" w:eastAsia="Times New Roman" w:hAnsi="Times New Roman" w:cs="Times New Roman"/>
+    <w:rPr>
       <w:color w:val="000000"/>
-      <w:kern w:val="0"/>
       <w:sz w:val="17"/>
       <w:szCs w:val="17"/>
-      <w14:ligatures w14:val="none"/>
     </w:rPr>
   </w:style>
   <w:style w:type="character" w:customStyle="1" w:styleId="s1">
@@ -1156,6 +2920,78 @@
       <w:sz w:val="10"/>
       <w:szCs w:val="10"/>
     </w:rPr>
+  </w:style>
+  <w:style w:type="paragraph" w:styleId="HTMLPreformatted">
+    <w:name w:val="HTML Preformatted"/>
+    <w:basedOn w:val="Normal"/>
+    <w:link w:val="HTMLPreformattedChar"/>
+    <w:uiPriority w:val="99"/>
+    <w:unhideWhenUsed/>
+    <w:rsid w:val="00265111"/>
+    <w:pPr>
+      <w:tabs>
+        <w:tab w:val="left" w:pos="916"/>
+        <w:tab w:val="left" w:pos="1832"/>
+        <w:tab w:val="left" w:pos="2748"/>
+        <w:tab w:val="left" w:pos="3664"/>
+        <w:tab w:val="left" w:pos="4580"/>
+        <w:tab w:val="left" w:pos="5496"/>
+        <w:tab w:val="left" w:pos="6412"/>
+        <w:tab w:val="left" w:pos="7328"/>
+        <w:tab w:val="left" w:pos="8244"/>
+        <w:tab w:val="left" w:pos="9160"/>
+        <w:tab w:val="left" w:pos="10076"/>
+        <w:tab w:val="left" w:pos="10992"/>
+        <w:tab w:val="left" w:pos="11908"/>
+        <w:tab w:val="left" w:pos="12824"/>
+        <w:tab w:val="left" w:pos="13740"/>
+        <w:tab w:val="left" w:pos="14656"/>
+      </w:tabs>
+    </w:pPr>
+    <w:rPr>
+      <w:rFonts w:ascii="Courier New" w:hAnsi="Courier New" w:cs="Courier New"/>
+      <w:sz w:val="20"/>
+      <w:szCs w:val="20"/>
+    </w:rPr>
+  </w:style>
+  <w:style w:type="character" w:customStyle="1" w:styleId="HTMLPreformattedChar">
+    <w:name w:val="HTML Preformatted Char"/>
+    <w:basedOn w:val="DefaultParagraphFont"/>
+    <w:link w:val="HTMLPreformatted"/>
+    <w:uiPriority w:val="99"/>
+    <w:rsid w:val="00265111"/>
+    <w:rPr>
+      <w:rFonts w:ascii="Courier New" w:eastAsia="Times New Roman" w:hAnsi="Courier New" w:cs="Courier New"/>
+      <w:kern w:val="0"/>
+      <w:sz w:val="20"/>
+      <w:szCs w:val="20"/>
+      <w14:ligatures w14:val="none"/>
+    </w:rPr>
+  </w:style>
+  <w:style w:type="paragraph" w:customStyle="1" w:styleId="p2">
+    <w:name w:val="p2"/>
+    <w:basedOn w:val="Normal"/>
+    <w:rsid w:val="00482CCE"/>
+  </w:style>
+  <w:style w:type="paragraph" w:customStyle="1" w:styleId="p3">
+    <w:name w:val="p3"/>
+    <w:basedOn w:val="Normal"/>
+    <w:rsid w:val="00482CCE"/>
+  </w:style>
+  <w:style w:type="character" w:customStyle="1" w:styleId="s2">
+    <w:name w:val="s2"/>
+    <w:basedOn w:val="DefaultParagraphFont"/>
+    <w:rsid w:val="00482CCE"/>
+    <w:rPr>
+      <w:rFonts w:ascii="Helvetica" w:hAnsi="Helvetica" w:hint="default"/>
+      <w:sz w:val="18"/>
+      <w:szCs w:val="18"/>
+    </w:rPr>
+  </w:style>
+  <w:style w:type="character" w:customStyle="1" w:styleId="apple-converted-space">
+    <w:name w:val="apple-converted-space"/>
+    <w:basedOn w:val="DefaultParagraphFont"/>
+    <w:rsid w:val="00482CCE"/>
   </w:style>
 </w:styles>
 </file>

</xml_diff>

<commit_message>
Uncertainty Updated to include uncertainty on the activation energy in the diffusion equation from Dohmen et al 2007
</commit_message>
<xml_diff>
--- a/Diffusion Round Robin/Towbin-Diffusion-Round-Robin-Results.docx
+++ b/Diffusion Round Robin/Towbin-Diffusion-Round-Robin-Results.docx
@@ -2058,10 +2058,10 @@
         </w:rPr>
         <w:lastRenderedPageBreak/>
         <w:drawing>
-          <wp:inline distT="0" distB="0" distL="0" distR="0" wp14:anchorId="6B60C4E1" wp14:editId="54BE7FE5">
+          <wp:inline distT="0" distB="0" distL="0" distR="0" wp14:anchorId="25588E1F" wp14:editId="40B1D315">
             <wp:extent cx="5943600" cy="6259195"/>
             <wp:effectExtent l="0" t="0" r="0" b="1905"/>
-            <wp:docPr id="460632261" name="Picture 14"/>
+            <wp:docPr id="758366525" name="Picture 1"/>
             <wp:cNvGraphicFramePr>
               <a:graphicFrameLocks xmlns:a="http://schemas.openxmlformats.org/drawingml/2006/main" noChangeAspect="1"/>
             </wp:cNvGraphicFramePr>
@@ -2069,7 +2069,7 @@
               <a:graphicData uri="http://schemas.openxmlformats.org/drawingml/2006/picture">
                 <pic:pic xmlns:pic="http://schemas.openxmlformats.org/drawingml/2006/picture">
                   <pic:nvPicPr>
-                    <pic:cNvPr id="460632261" name="Picture 460632261"/>
+                    <pic:cNvPr id="758366525" name="Picture 758366525"/>
                     <pic:cNvPicPr/>
                   </pic:nvPicPr>
                   <pic:blipFill>
@@ -2096,7 +2096,136 @@
     </w:p>
     <w:p>
       <w:r>
-        <w:t xml:space="preserve">Table 1. Reduced </w:t>
+        <w:t xml:space="preserve">Table 1. </w:t>
+      </w:r>
+      <w:r>
+        <w:rPr>
+          <w:b/>
+          <w:bCs/>
+        </w:rPr>
+        <w:t xml:space="preserve">Reduced </w:t>
+      </w:r>
+      <w:r>
+        <w:rPr>
+          <w:rFonts w:ascii="Cambria Math" w:hAnsi="Cambria Math" w:cs="Cambria Math"/>
+          <w:b/>
+          <w:bCs/>
+        </w:rPr>
+        <w:t>𝜒</w:t>
+      </w:r>
+      <w:r>
+        <w:rPr>
+          <w:rFonts w:ascii="Cambria Math" w:hAnsi="Cambria Math" w:cs="Cambria Math"/>
+          <w:b/>
+          <w:bCs/>
+          <w:vertAlign w:val="superscript"/>
+        </w:rPr>
+        <w:t>2</w:t>
+      </w:r>
+      <w:r>
+        <w:rPr>
+          <w:rFonts w:ascii="Cambria Math" w:hAnsi="Cambria Math" w:cs="Cambria Math"/>
+          <w:b/>
+          <w:bCs/>
+        </w:rPr>
+        <w:t xml:space="preserve"> </w:t>
+      </w:r>
+      <w:r>
+        <w:rPr>
+          <w:rFonts w:ascii="Cambria Math" w:hAnsi="Cambria Math" w:cs="Cambria Math"/>
+        </w:rPr>
+        <w:t>as a measure of goodness of fit</w:t>
+      </w:r>
+      <w:r>
+        <w:rPr>
+          <w:rFonts w:ascii="Cambria Math" w:hAnsi="Cambria Math" w:cs="Cambria Math"/>
+        </w:rPr>
+        <w:t xml:space="preserve"> for comparison to other models fit to the same profiles. </w:t>
+      </w:r>
+      <w:r>
+        <w:rPr>
+          <w:rFonts w:ascii="Cambria Math" w:hAnsi="Cambria Math" w:cs="Cambria Math"/>
+        </w:rPr>
+        <w:t>Best fit times</w:t>
+      </w:r>
+      <w:r>
+        <w:rPr>
+          <w:rFonts w:ascii="Cambria Math" w:hAnsi="Cambria Math" w:cs="Cambria Math"/>
+        </w:rPr>
+        <w:t xml:space="preserve"> </w:t>
+      </w:r>
+      <w:r>
+        <w:rPr>
+          <w:rFonts w:ascii="Cambria Math" w:hAnsi="Cambria Math" w:cs="Cambria Math"/>
+        </w:rPr>
+        <w:t xml:space="preserve">as determined by </w:t>
+      </w:r>
+      <w:r>
+        <w:rPr>
+          <w:rFonts w:ascii="Cambria Math" w:hAnsi="Cambria Math" w:cs="Cambria Math"/>
+          <w:b/>
+          <w:bCs/>
+        </w:rPr>
+        <w:t xml:space="preserve">minimum </w:t>
+      </w:r>
+      <w:r>
+        <w:rPr>
+          <w:rFonts w:ascii="Cambria Math" w:hAnsi="Cambria Math" w:cs="Cambria Math"/>
+          <w:b/>
+          <w:bCs/>
+        </w:rPr>
+        <w:t>𝜒</w:t>
+      </w:r>
+      <w:r>
+        <w:rPr>
+          <w:rFonts w:ascii="Cambria Math" w:hAnsi="Cambria Math" w:cs="Cambria Math"/>
+          <w:b/>
+          <w:bCs/>
+          <w:vertAlign w:val="superscript"/>
+        </w:rPr>
+        <w:t>2</w:t>
+      </w:r>
+      <w:r>
+        <w:rPr>
+          <w:rFonts w:ascii="Cambria Math" w:hAnsi="Cambria Math" w:cs="Cambria Math"/>
+        </w:rPr>
+        <w:t xml:space="preserve"> </w:t>
+      </w:r>
+      <w:r>
+        <w:rPr>
+          <w:rFonts w:ascii="Cambria Math" w:hAnsi="Cambria Math" w:cs="Cambria Math"/>
+        </w:rPr>
+        <w:t>from timesteps of diffusion models. Fit u</w:t>
+      </w:r>
+      <w:r>
+        <w:rPr>
+          <w:rFonts w:ascii="Cambria Math" w:hAnsi="Cambria Math" w:cs="Cambria Math"/>
+        </w:rPr>
+        <w:t>ncertainties for model</w:t>
+      </w:r>
+      <w:r>
+        <w:rPr>
+          <w:rFonts w:ascii="Cambria Math" w:hAnsi="Cambria Math" w:cs="Cambria Math"/>
+        </w:rPr>
+        <w:t xml:space="preserve"> a given model</w:t>
+      </w:r>
+      <w:r>
+        <w:rPr>
+          <w:rFonts w:ascii="Cambria Math" w:hAnsi="Cambria Math" w:cs="Cambria Math"/>
+        </w:rPr>
+        <w:t xml:space="preserve"> </w:t>
+      </w:r>
+      <w:r>
+        <w:rPr>
+          <w:rFonts w:ascii="Cambria Math" w:hAnsi="Cambria Math" w:cs="Cambria Math"/>
+        </w:rPr>
+        <w:t xml:space="preserve">were estimated from a +1 contour of the minimum </w:t>
+      </w:r>
+      <w:r>
+        <w:t>r</w:t>
+      </w:r>
+      <w:r>
+        <w:t xml:space="preserve">educed </w:t>
       </w:r>
       <w:r>
         <w:rPr>
@@ -2115,19 +2244,16 @@
         <w:rPr>
           <w:rFonts w:ascii="Cambria Math" w:hAnsi="Cambria Math" w:cs="Cambria Math"/>
         </w:rPr>
-        <w:t xml:space="preserve"> as a measure of goodness of fit</w:t>
+        <w:t xml:space="preserve"> values. </w:t>
       </w:r>
       <w:r>
         <w:rPr>
           <w:rFonts w:ascii="Cambria Math" w:hAnsi="Cambria Math" w:cs="Cambria Math"/>
         </w:rPr>
-        <w:t xml:space="preserve"> for comparison to other models fit to the same profiles. Best fit times </w:t>
-      </w:r>
-      <w:r>
-        <w:rPr>
-          <w:rFonts w:ascii="Cambria Math" w:hAnsi="Cambria Math" w:cs="Cambria Math"/>
-        </w:rPr>
-        <w:t xml:space="preserve">as determined by minimum </w:t>
+        <w:t xml:space="preserve">This approximation is most valid when the minimum </w:t>
+      </w:r>
+      <w:r>
+        <w:t xml:space="preserve">reduced </w:t>
       </w:r>
       <w:r>
         <w:rPr>
@@ -2145,44 +2271,86 @@
       <w:r>
         <w:rPr>
           <w:rFonts w:ascii="Cambria Math" w:hAnsi="Cambria Math" w:cs="Cambria Math"/>
+          <w:vertAlign w:val="superscript"/>
         </w:rPr>
         <w:t xml:space="preserve"> </w:t>
       </w:r>
       <w:r>
-        <w:rPr>
-          <w:rFonts w:ascii="Cambria Math" w:hAnsi="Cambria Math" w:cs="Cambria Math"/>
-        </w:rPr>
-        <w:t>from timesteps of diffusion models. Fit u</w:t>
-      </w:r>
-      <w:r>
-        <w:rPr>
-          <w:rFonts w:ascii="Cambria Math" w:hAnsi="Cambria Math" w:cs="Cambria Math"/>
-        </w:rPr>
-        <w:t>ncertainties for model</w:t>
-      </w:r>
-      <w:r>
-        <w:rPr>
-          <w:rFonts w:ascii="Cambria Math" w:hAnsi="Cambria Math" w:cs="Cambria Math"/>
-        </w:rPr>
-        <w:t xml:space="preserve"> a given model</w:t>
-      </w:r>
-      <w:r>
-        <w:rPr>
-          <w:rFonts w:ascii="Cambria Math" w:hAnsi="Cambria Math" w:cs="Cambria Math"/>
-        </w:rPr>
+        <w:t>is near 1</w:t>
+      </w:r>
+      <w:r>
+        <w:t xml:space="preserve"> and positive and negative uncertainties are roughly symmetrical. </w:t>
+      </w:r>
+      <w:r>
+        <w:t>We chose this method since it is computationally efficient and roughly valid for our samples.</w:t>
+      </w:r>
+      <w:r>
         <w:t xml:space="preserve"> </w:t>
       </w:r>
       <w:r>
-        <w:rPr>
-          <w:rFonts w:ascii="Cambria Math" w:hAnsi="Cambria Math" w:cs="Cambria Math"/>
-        </w:rPr>
-        <w:t xml:space="preserve">were estimated from a +1 contour of the minimum </w:t>
-      </w:r>
-      <w:r>
-        <w:t>r</w:t>
-      </w:r>
-      <w:r>
-        <w:t xml:space="preserve">educed </w:t>
+        <w:t>Andrae</w:t>
+      </w:r>
+      <w:r>
+        <w:t xml:space="preserve"> (2010) and </w:t>
+      </w:r>
+      <w:r>
+        <w:t>Andrae</w:t>
+      </w:r>
+      <w:r>
+        <w:t xml:space="preserve"> et al. (2010) are thorough</w:t>
+      </w:r>
+      <w:r>
+        <w:t xml:space="preserve"> reviews of the limitations of these choices </w:t>
+      </w:r>
+      <w:r>
+        <w:t xml:space="preserve">and that they are difficult to apply to optimizing more than one parameter (i.e. time, step-positions, concentrations, boundary conditions) in non-linear systems. </w:t>
+      </w:r>
+      <w:r>
+        <w:rPr>
+          <w:b/>
+          <w:bCs/>
+        </w:rPr>
+        <w:t>Diffusion</w:t>
+      </w:r>
+      <w:r>
+        <w:rPr>
+          <w:b/>
+          <w:bCs/>
+        </w:rPr>
+        <w:t xml:space="preserve"> Uncertainty</w:t>
+      </w:r>
+      <w:r>
+        <w:t xml:space="preserve"> refers to uncertainty in estimated timescales </w:t>
+      </w:r>
+      <w:proofErr w:type="gramStart"/>
+      <w:r>
+        <w:t>due to the effects</w:t>
+      </w:r>
+      <w:proofErr w:type="gramEnd"/>
+      <w:r>
+        <w:t xml:space="preserve"> of uncertainty in temperature, pressure, oxygen fugacity</w:t>
+      </w:r>
+      <w:r>
+        <w:t>, and activation energy</w:t>
+      </w:r>
+      <w:r>
+        <w:t xml:space="preserve"> on the Olivine Fe-Mg diffusivity. </w:t>
+      </w:r>
+      <w:r>
+        <w:t xml:space="preserve">This uncertainty was </w:t>
+      </w:r>
+      <w:r>
+        <w:lastRenderedPageBreak/>
+        <w:t>evaluated using Monto Carlo sampling (n=1,000,000)</w:t>
+      </w:r>
+      <w:r>
+        <w:t xml:space="preserve"> drawing from normal distributions for each parameter. </w:t>
+      </w:r>
+      <w:r>
+        <w:t xml:space="preserve">Approximate combined uncertainty </w:t>
+      </w:r>
+      <w:r>
+        <w:t xml:space="preserve">is the room mean squared uncertainty from the reduced </w:t>
       </w:r>
       <w:r>
         <w:rPr>
@@ -2200,54 +2368,21 @@
       <w:r>
         <w:rPr>
           <w:rFonts w:ascii="Cambria Math" w:hAnsi="Cambria Math" w:cs="Cambria Math"/>
-        </w:rPr>
-        <w:t xml:space="preserve"> values. </w:t>
+          <w:vertAlign w:val="superscript"/>
+        </w:rPr>
+        <w:t xml:space="preserve"> </w:t>
       </w:r>
       <w:r>
         <w:rPr>
           <w:rFonts w:ascii="Cambria Math" w:hAnsi="Cambria Math" w:cs="Cambria Math"/>
         </w:rPr>
-        <w:t xml:space="preserve">This approximation is most valid when the minimum </w:t>
-      </w:r>
-      <w:proofErr w:type="spellStart"/>
-      <w:r>
-        <w:rPr>
-          <w:rFonts w:ascii="Cambria Math" w:hAnsi="Cambria Math" w:cs="Cambria Math"/>
-        </w:rPr>
-        <w:t>minimum</w:t>
-      </w:r>
-      <w:proofErr w:type="spellEnd"/>
-      <w:r>
-        <w:rPr>
-          <w:rFonts w:ascii="Cambria Math" w:hAnsi="Cambria Math" w:cs="Cambria Math"/>
-        </w:rPr>
+        <w:t xml:space="preserve">minimization uncertainty and the diffusion uncertainty. To a first order this can be used to estimate the total uncertainty of timescale calculations. </w:t>
+      </w:r>
+    </w:p>
+    <w:p/>
+    <w:p>
+      <w:r>
         <w:t xml:space="preserve"> </w:t>
-      </w:r>
-      <w:r>
-        <w:t xml:space="preserve">reduced </w:t>
-      </w:r>
-      <w:r>
-        <w:rPr>
-          <w:rFonts w:ascii="Cambria Math" w:hAnsi="Cambria Math" w:cs="Cambria Math"/>
-        </w:rPr>
-        <w:t>𝜒</w:t>
-      </w:r>
-      <w:r>
-        <w:rPr>
-          <w:rFonts w:ascii="Cambria Math" w:hAnsi="Cambria Math" w:cs="Cambria Math"/>
-          <w:vertAlign w:val="superscript"/>
-        </w:rPr>
-        <w:t>2</w:t>
-      </w:r>
-      <w:r>
-        <w:rPr>
-          <w:rFonts w:ascii="Cambria Math" w:hAnsi="Cambria Math" w:cs="Cambria Math"/>
-          <w:vertAlign w:val="superscript"/>
-        </w:rPr>
-        <w:t xml:space="preserve"> </w:t>
-      </w:r>
-      <w:r>
-        <w:t>is near 1</w:t>
       </w:r>
     </w:p>
     <w:p>

</xml_diff>

<commit_message>
Activation energy uncertainty included in Monte Carlo estimates of diffusion coefficients
</commit_message>
<xml_diff>
--- a/Diffusion Round Robin/Towbin-Diffusion-Round-Robin-Results.docx
+++ b/Diffusion Round Robin/Towbin-Diffusion-Round-Robin-Results.docx
@@ -2334,14 +2334,17 @@
         <w:t>, and activation energy</w:t>
       </w:r>
       <w:r>
+        <w:t xml:space="preserve"> (201 ± 8 kJ/mol)</w:t>
+      </w:r>
+      <w:r>
         <w:t xml:space="preserve"> on the Olivine Fe-Mg diffusivity. </w:t>
       </w:r>
       <w:r>
-        <w:t xml:space="preserve">This uncertainty was </w:t>
+        <w:t xml:space="preserve">This </w:t>
       </w:r>
       <w:r>
         <w:lastRenderedPageBreak/>
-        <w:t>evaluated using Monto Carlo sampling (n=1,000,000)</w:t>
+        <w:t>uncertainty was evaluated using Monto Carlo sampling (n=1,000,000)</w:t>
       </w:r>
       <w:r>
         <w:t xml:space="preserve"> drawing from normal distributions for each parameter. </w:t>

</xml_diff>